<commit_message>
Experimento de LangSmith, captura de traza y firma del informe
Tareas T065 y T066 de tasks.md.

- eval/run_langsmith_experiment.py sube los 38 casos como conjunto de datos de
  LangSmith y corre el agente como experimento con las mismas verificaciones
  deterministas de run_eval.py. Corrida del 2026-10-12: 38 de 38.
- Informe: captura de una traza de LangSmith, nombre del autor y resultado del
  experimento. PDF y Word regenerados (9 paginas sin portada).
- README y research.md documentan el experimento.

Co-Authored-By: Claude Opus 5.5 <noreply@anthropic.com>
</commit_message>
<xml_diff>
--- a/docs/informe/informe.docx
+++ b/docs/informe/informe.docx
@@ -28,7 +28,7 @@
         <w:rPr>
           <w:sz w:val="21"/>
         </w:rPr>
-        <w:t>Oct 9, 2026 · @Santiago</w:t>
+        <w:t>Santiago Nicolas Martinez · Trabajo individual · Octubre de 2026</w:t>
       </w:r>
     </w:p>
     <w:p>
@@ -504,7 +504,7 @@
               <w:rPr>
                 <w:sz w:val="19"/>
               </w:rPr>
-              <w:t>64 tareas, marcadas a medida que se hicieron</w:t>
+              <w:t>66 tareas, marcadas a medida que se hicieron</w:t>
             </w:r>
           </w:p>
         </w:tc>
@@ -700,7 +700,7 @@
         <w:rPr>
           <w:sz w:val="21"/>
         </w:rPr>
-        <w:t xml:space="preserve"> Las tareas T045 a T064 se agregaron al probar el age</w:t>
+        <w:t xml:space="preserve"> Las tareas T045 a T066 se agregaron al probar el age</w:t>
       </w:r>
       <w:r>
         <w:rPr>
@@ -1677,8 +1677,8 @@
         </w:rPr>
         <w:lastRenderedPageBreak/>
         <w:drawing>
-          <wp:inline distT="0" distB="0" distL="0" distR="0" wp14:anchorId="7F0EB7B8" wp14:editId="1DE3C670">
-            <wp:extent cx="5334000" cy="4040187"/>
+          <wp:inline distT="0" distB="0" distL="0" distR="0" wp14:anchorId="62F0916B" wp14:editId="1E9F5BC0">
+            <wp:extent cx="4445000" cy="3366823"/>
             <wp:effectExtent l="0" t="0" r="0" b="0"/>
             <wp:docPr id="1" name="image1" descr="grafo del agente · 5 rutas, reintento de SQL"/>
             <wp:cNvGraphicFramePr>
@@ -1700,7 +1700,7 @@
                   <pic:spPr>
                     <a:xfrm>
                       <a:off x="0" y="0"/>
-                      <a:ext cx="5334000" cy="4040187"/>
+                      <a:ext cx="4445000" cy="3366823"/>
                     </a:xfrm>
                     <a:prstGeom prst="rect">
                       <a:avLst/>
@@ -2202,7 +2202,6 @@
         <w:spacing w:before="200" w:after="80" w:line="240" w:lineRule="auto"/>
       </w:pPr>
       <w:r>
-        <w:lastRenderedPageBreak/>
         <w:t>Decisiones técnicas</w:t>
       </w:r>
     </w:p>
@@ -2271,6 +2270,7 @@
               <w:rPr>
                 <w:sz w:val="19"/>
               </w:rPr>
+              <w:lastRenderedPageBreak/>
               <w:t>Decisión</w:t>
             </w:r>
           </w:p>
@@ -3115,7 +3115,6 @@
           <w:b/>
           <w:sz w:val="21"/>
         </w:rPr>
-        <w:lastRenderedPageBreak/>
         <w:t>Resultado con Gemini real.</w:t>
       </w:r>
       <w:r>
@@ -3258,6 +3257,7 @@
               <w:rPr>
                 <w:sz w:val="19"/>
               </w:rPr>
+              <w:lastRenderedPageBreak/>
               <w:t>1</w:t>
             </w:r>
           </w:p>
@@ -4610,7 +4610,6 @@
               <w:rPr>
                 <w:sz w:val="19"/>
               </w:rPr>
-              <w:lastRenderedPageBreak/>
               <w:t>Pregunta</w:t>
             </w:r>
           </w:p>
@@ -4692,7 +4691,14 @@
               <w:rPr>
                 <w:sz w:val="19"/>
               </w:rPr>
-              <w:t>¿Cuántas alarmas críticas tuvo la bomba P-101 en septiembre de 2026?</w:t>
+              <w:t xml:space="preserve">¿Cuántas alarmas críticas tuvo la bomba P-101 en </w:t>
+            </w:r>
+            <w:r>
+              <w:rPr>
+                <w:sz w:val="19"/>
+              </w:rPr>
+              <w:lastRenderedPageBreak/>
+              <w:t>septiembre de 2026?</w:t>
             </w:r>
           </w:p>
         </w:tc>
@@ -4711,6 +4717,7 @@
               <w:rPr>
                 <w:sz w:val="19"/>
               </w:rPr>
+              <w:lastRenderedPageBreak/>
               <w:t>Base</w:t>
             </w:r>
           </w:p>
@@ -4749,7 +4756,14 @@
               <w:rPr>
                 <w:sz w:val="19"/>
               </w:rPr>
-              <w:t>La bomba P-101 tuvo 1 alarma crítica en septiembre de 2026.</w:t>
+              <w:t xml:space="preserve">La bomba P-101 tuvo 1 alarma crítica en </w:t>
+            </w:r>
+            <w:r>
+              <w:rPr>
+                <w:sz w:val="19"/>
+              </w:rPr>
+              <w:lastRenderedPageBreak/>
+              <w:t>septiembre de 2026.</w:t>
             </w:r>
           </w:p>
         </w:tc>
@@ -4770,6 +4784,7 @@
               <w:rPr>
                 <w:sz w:val="19"/>
               </w:rPr>
+              <w:lastRenderedPageBreak/>
               <w:t>¿Cuál fue el valor máximo de temperatura registrado en el motor M-301?</w:t>
             </w:r>
           </w:p>
@@ -5393,8 +5408,8 @@
         </w:rPr>
         <w:lastRenderedPageBreak/>
         <w:drawing>
-          <wp:inline distT="0" distB="0" distL="0" distR="0" wp14:anchorId="2715D662" wp14:editId="464071E1">
-            <wp:extent cx="5334000" cy="3333750"/>
+          <wp:inline distT="0" distB="0" distL="0" distR="0" wp14:anchorId="383ABE1E" wp14:editId="628F97A9">
+            <wp:extent cx="4445000" cy="2778125"/>
             <wp:effectExtent l="0" t="0" r="0" b="0"/>
             <wp:docPr id="2" name="image2" descr="Pregunta de datos con la consulta SQL"/>
             <wp:cNvGraphicFramePr>
@@ -5416,7 +5431,7 @@
                   <pic:spPr>
                     <a:xfrm>
                       <a:off x="0" y="0"/>
-                      <a:ext cx="5334000" cy="3333750"/>
+                      <a:ext cx="4445000" cy="2778125"/>
                     </a:xfrm>
                     <a:prstGeom prst="rect">
                       <a:avLst/>
@@ -5456,8 +5471,8 @@
           <w:sz w:val="21"/>
         </w:rPr>
         <w:drawing>
-          <wp:inline distT="0" distB="0" distL="0" distR="0" wp14:anchorId="7EE04209" wp14:editId="315DB19C">
-            <wp:extent cx="5334000" cy="3333750"/>
+          <wp:inline distT="0" distB="0" distL="0" distR="0" wp14:anchorId="46D1EE07" wp14:editId="39BA101A">
+            <wp:extent cx="4445000" cy="2778125"/>
             <wp:effectExtent l="0" t="0" r="0" b="0"/>
             <wp:docPr id="3" name="image3" descr="Pregunta combinada con base y documentos"/>
             <wp:cNvGraphicFramePr>
@@ -5479,7 +5494,7 @@
                   <pic:spPr>
                     <a:xfrm>
                       <a:off x="0" y="0"/>
-                      <a:ext cx="5334000" cy="3333750"/>
+                      <a:ext cx="4445000" cy="2778125"/>
                     </a:xfrm>
                     <a:prstGeom prst="rect">
                       <a:avLst/>
@@ -5556,7 +5571,7 @@
         <w:rPr>
           <w:sz w:val="21"/>
         </w:rPr>
-        <w:t xml:space="preserve">, y la evaluación adjunta a cada traza el resultado del caso. Cada traza muestra los pasos del grafo por separado. Ejemplo leído desde la API de LangSmith, pregunta combinada sobre el motor M-301, 4,8 s en total: </w:t>
+        <w:t xml:space="preserve">, y la evaluación adjunta a cada traza el resultado del caso. La captura muestra la traza de una pregunta combinada sobre el motor M-301, con cada paso del grafo por separado (4,64 s en total): </w:t>
       </w:r>
       <w:r>
         <w:rPr>
@@ -5569,7 +5584,7 @@
         <w:rPr>
           <w:sz w:val="21"/>
         </w:rPr>
-        <w:t xml:space="preserve"> 1,67 s, </w:t>
+        <w:t xml:space="preserve"> 1,91 s, </w:t>
       </w:r>
       <w:r>
         <w:rPr>
@@ -5582,40 +5597,53 @@
         <w:rPr>
           <w:sz w:val="21"/>
         </w:rPr>
-        <w:t xml:space="preserve"> 0,92 s, </w:t>
+        <w:t xml:space="preserve"> 0,93 s, </w:t>
       </w:r>
       <w:r>
         <w:rPr>
           <w:rStyle w:val="CodeChar"/>
           <w:sz w:val="21"/>
         </w:rPr>
-        <w:t>sql_exe</w:t>
+        <w:t>sql_validate</w:t>
+      </w:r>
+      <w:r>
+        <w:rPr>
+          <w:sz w:val="21"/>
+        </w:rPr>
+        <w:t xml:space="preserve"> 0,01 s, </w:t>
       </w:r>
       <w:r>
         <w:rPr>
           <w:rStyle w:val="CodeChar"/>
           <w:sz w:val="21"/>
         </w:rPr>
-        <w:t>cute</w:t>
-      </w:r>
-      <w:r>
-        <w:rPr>
-          <w:sz w:val="21"/>
-        </w:rPr>
-        <w:t xml:space="preserve"> 0,04 s, </w:t>
+        <w:t>sql_e</w:t>
       </w:r>
       <w:r>
         <w:rPr>
           <w:rStyle w:val="CodeChar"/>
           <w:sz w:val="21"/>
         </w:rPr>
+        <w:t>xecute</w:t>
+      </w:r>
+      <w:r>
+        <w:rPr>
+          <w:sz w:val="21"/>
+        </w:rPr>
+        <w:t xml:space="preserve"> 0,06 s, </w:t>
+      </w:r>
+      <w:r>
+        <w:rPr>
+          <w:rStyle w:val="CodeChar"/>
+          <w:sz w:val="21"/>
+        </w:rPr>
         <w:t>retrieve</w:t>
       </w:r>
       <w:r>
         <w:rPr>
           <w:sz w:val="21"/>
         </w:rPr>
-        <w:t xml:space="preserve"> 0,53 s y </w:t>
+        <w:t xml:space="preserve"> 0,65 s y </w:t>
       </w:r>
       <w:r>
         <w:rPr>
@@ -5628,7 +5656,7 @@
         <w:rPr>
           <w:sz w:val="21"/>
         </w:rPr>
-        <w:t xml:space="preserve"> 1,61 s.</w:t>
+        <w:t xml:space="preserve"> 1,07 s. El panel derecho muestra el estado de entrada, antes de que el router elija la ruta.</w:t>
       </w:r>
     </w:p>
     <w:p>
@@ -5640,25 +5668,106 @@
       </w:pPr>
       <w:r>
         <w:rPr>
-          <w:b/>
-          <w:sz w:val="21"/>
-        </w:rPr>
-        <w:t>Pendiente:</w:t>
-      </w:r>
-      <w:r>
-        <w:rPr>
-          <w:sz w:val="21"/>
-        </w:rPr>
-        <w:t xml:space="preserve"> agregar una captura de pantalla de una traza, que se toma desde la cuenta de LangSmith.</w:t>
+          <w:noProof/>
+          <w:sz w:val="21"/>
+        </w:rPr>
+        <w:lastRenderedPageBreak/>
+        <w:drawing>
+          <wp:inline distT="0" distB="0" distL="0" distR="0" wp14:anchorId="26BF4554" wp14:editId="320889E4">
+            <wp:extent cx="4445000" cy="3028717"/>
+            <wp:effectExtent l="0" t="0" r="0" b="0"/>
+            <wp:docPr id="4" name="image4" descr="Traza en LangSmith de una pregunta combinada"/>
+            <wp:cNvGraphicFramePr>
+              <a:graphicFrameLocks xmlns:a="http://schemas.openxmlformats.org/drawingml/2006/main" noChangeAspect="1"/>
+            </wp:cNvGraphicFramePr>
+            <a:graphic xmlns:a="http://schemas.openxmlformats.org/drawingml/2006/main">
+              <a:graphicData uri="http://schemas.openxmlformats.org/drawingml/2006/picture">
+                <pic:pic xmlns:pic="http://schemas.openxmlformats.org/drawingml/2006/picture">
+                  <pic:nvPicPr>
+                    <pic:cNvPr id="4" name="image4" descr="Traza en LangSmith de una pregunta combinada"/>
+                    <pic:cNvPicPr/>
+                  </pic:nvPicPr>
+                  <pic:blipFill>
+                    <a:blip r:embed="rId8"/>
+                    <a:stretch>
+                      <a:fillRect/>
+                    </a:stretch>
+                  </pic:blipFill>
+                  <pic:spPr>
+                    <a:xfrm>
+                      <a:off x="0" y="0"/>
+                      <a:ext cx="4445000" cy="3028717"/>
+                    </a:xfrm>
+                    <a:prstGeom prst="rect">
+                      <a:avLst/>
+                    </a:prstGeom>
+                  </pic:spPr>
+                </pic:pic>
+              </a:graphicData>
+            </a:graphic>
+          </wp:inline>
+        </w:drawing>
       </w:r>
     </w:p>
     <w:p>
       <w:pPr>
+        <w:spacing w:after="100" w:line="240" w:lineRule="auto"/>
+        <w:rPr>
+          <w:sz w:val="21"/>
+        </w:rPr>
+      </w:pPr>
+      <w:r>
+        <w:rPr>
+          <w:b/>
+          <w:sz w:val="21"/>
+        </w:rPr>
+        <w:t>Evaluación dentro de LangSmith.</w:t>
+      </w:r>
+      <w:r>
+        <w:rPr>
+          <w:sz w:val="21"/>
+        </w:rPr>
+        <w:t xml:space="preserve"> Los 38 casos se subieron como conjunto de datos (</w:t>
+      </w:r>
+      <w:r>
+        <w:rPr>
+          <w:rStyle w:val="CodeChar"/>
+          <w:sz w:val="21"/>
+        </w:rPr>
+        <w:t>agente-sql-telemetria-golden</w:t>
+      </w:r>
+      <w:r>
+        <w:rPr>
+          <w:sz w:val="21"/>
+        </w:rPr>
+        <w:t>) y el a</w:t>
+      </w:r>
+      <w:r>
+        <w:rPr>
+          <w:sz w:val="21"/>
+        </w:rPr>
+        <w:t>gente se corrió como un experimento con las mismas verificaciones (</w:t>
+      </w:r>
+      <w:r>
+        <w:rPr>
+          <w:rStyle w:val="CodeChar"/>
+          <w:sz w:val="21"/>
+        </w:rPr>
+        <w:t>eval/run_langsmith_experiment.py</w:t>
+      </w:r>
+      <w:r>
+        <w:rPr>
+          <w:sz w:val="21"/>
+        </w:rPr>
+        <w:t>). Resultado del 12 de octubre de 2026: 38 de 38 casos aprobados.</w:t>
+      </w:r>
+    </w:p>
+    <w:p>
+      <w:pPr>
         <w:pStyle w:val="Ttulo2"/>
         <w:spacing w:before="200" w:after="80" w:line="240" w:lineRule="auto"/>
       </w:pPr>
       <w:r>
-        <w:lastRenderedPageBreak/>
         <w:t>Cumplimiento de criterios y limitaciones</w:t>
       </w:r>
     </w:p>
@@ -5770,13 +5879,7 @@
               <w:rPr>
                 <w:sz w:val="19"/>
               </w:rPr>
-              <w:t>Base relacional</w:t>
-            </w:r>
-            <w:r>
-              <w:rPr>
-                <w:sz w:val="19"/>
-              </w:rPr>
-              <w:t xml:space="preserve"> con al menos 5 tablas y más de 15 filas por tabla</w:t>
+              <w:t>Base relacional con al menos 5 tablas y más de 15 filas por tabla</w:t>
             </w:r>
           </w:p>
         </w:tc>
@@ -6056,7 +6159,7 @@
               <w:rPr>
                 <w:sz w:val="19"/>
               </w:rPr>
-              <w:t>8 páginas en el PDF de docs/informe/</w:t>
+              <w:t>9 páginas sin la portada, en el PDF de docs/informe/</w:t>
             </w:r>
           </w:p>
         </w:tc>
@@ -6419,13 +6522,7 @@
               <w:rPr>
                 <w:sz w:val="19"/>
               </w:rPr>
-              <w:t xml:space="preserve"> y las capturas de e</w:t>
-            </w:r>
-            <w:r>
-              <w:rPr>
-                <w:sz w:val="19"/>
-              </w:rPr>
-              <w:t>ste informe y de docs/informe/capturas/</w:t>
+              <w:t xml:space="preserve"> y las capturas de este informe y de docs/informe/capturas/</w:t>
             </w:r>
           </w:p>
         </w:tc>
@@ -6465,26 +6562,26 @@
               <w:rPr>
                 <w:sz w:val="19"/>
               </w:rPr>
-              <w:t>Cumplido. Las trazas y el resultado de cada caso quedaron registrados en el servicio real</w:t>
-            </w:r>
-          </w:p>
-        </w:tc>
-        <w:tc>
-          <w:tcPr>
-            <w:tcW w:w="3120" w:type="dxa"/>
-          </w:tcPr>
-          <w:p>
-            <w:pPr>
-              <w:spacing w:before="20" w:after="20" w:line="240" w:lineRule="auto"/>
-              <w:rPr>
-                <w:sz w:val="19"/>
-              </w:rPr>
-            </w:pPr>
-            <w:r>
-              <w:rPr>
-                <w:sz w:val="19"/>
-              </w:rPr>
-              <w:t>Pasos y tiempos de una traza en la sección de evidencias. Captura de pantalla pendiente</w:t>
+              <w:t>Cumplido. Trazas, conjunto de datos y experimento de evaluación en el servicio real</w:t>
+            </w:r>
+          </w:p>
+        </w:tc>
+        <w:tc>
+          <w:tcPr>
+            <w:tcW w:w="3120" w:type="dxa"/>
+          </w:tcPr>
+          <w:p>
+            <w:pPr>
+              <w:spacing w:before="20" w:after="20" w:line="240" w:lineRule="auto"/>
+              <w:rPr>
+                <w:sz w:val="19"/>
+              </w:rPr>
+            </w:pPr>
+            <w:r>
+              <w:rPr>
+                <w:sz w:val="19"/>
+              </w:rPr>
+              <w:t>Captura de una traza con sus pasos y tiempos en la sección de evidencias</w:t>
             </w:r>
           </w:p>
         </w:tc>
@@ -6501,7 +6598,14 @@
         <w:rPr>
           <w:sz w:val="21"/>
         </w:rPr>
-        <w:t>El despliegue en la nube del agente no se eligió como criterio.</w:t>
+        <w:lastRenderedPageBreak/>
+        <w:t>El desp</w:t>
+      </w:r>
+      <w:r>
+        <w:rPr>
+          <w:sz w:val="21"/>
+        </w:rPr>
+        <w:t>liegue en la nube del agente no se eligió como criterio.</w:t>
       </w:r>
     </w:p>
     <w:p>
@@ -6727,10 +6831,10 @@
 <file path=word/numbering.xml><?xml version="1.0" encoding="utf-8"?>
 <w:numbering xmlns:wpc="http://schemas.microsoft.com/office/word/2010/wordprocessingCanvas" xmlns:cx="http://schemas.microsoft.com/office/drawing/2014/chartex" xmlns:cx1="http://schemas.microsoft.com/office/drawing/2015/9/8/chartex" xmlns:cx2="http://schemas.microsoft.com/office/drawing/2015/10/21/chartex" xmlns:cx3="http://schemas.microsoft.com/office/drawing/2016/5/9/chartex" xmlns:cx4="http://schemas.microsoft.com/office/drawing/2016/5/10/chartex" xmlns:cx5="http://schemas.microsoft.com/office/drawing/2016/5/11/chartex" xmlns:cx6="http://schemas.microsoft.com/office/drawing/2016/5/12/chartex" xmlns:cx7="http://schemas.microsoft.com/office/drawing/2016/5/13/chartex" xmlns:cx8="http://schemas.microsoft.com/office/drawing/2016/5/14/chartex" xmlns:mc="http://schemas.openxmlformats.org/markup-compatibility/2006" xmlns:aink="http://schemas.microsoft.com/office/drawing/2016/ink" xmlns:am3d="http://schemas.microsoft.com/office/drawing/2017/model3d" xmlns:o="urn:schemas-microsoft-com:office:office" xmlns:r="http://schemas.openxmlformats.org/officeDocument/2006/relationships" xmlns:m="http://schemas.openxmlformats.org/officeDocument/2006/math" xmlns:v="urn:schemas-microsoft-com:vml" xmlns:wp14="http://schemas.microsoft.com/office/word/2010/wordprocessingDrawing" xmlns:wp="http://schemas.openxmlformats.org/drawingml/2006/wordprocessingDrawing" xmlns:w10="urn:schemas-microsoft-com:office:word" xmlns:w="http://schemas.openxmlformats.org/wordprocessingml/2006/main" xmlns:w14="http://schemas.microsoft.com/office/word/2010/wordml" xmlns:w15="http://schemas.microsoft.com/office/word/2012/wordml" xmlns:w16cex="http://schemas.microsoft.com/office/word/2018/wordml/cex" xmlns:w16cid="http://schemas.microsoft.com/office/word/2016/wordml/cid" xmlns:w16="http://schemas.microsoft.com/office/word/2018/wordml" xmlns:w16sdtdh="http://schemas.microsoft.com/office/word/2020/wordml/sdtdatahash" xmlns:w16se="http://schemas.microsoft.com/office/word/2015/wordml/symex" xmlns:wpg="http://schemas.microsoft.com/office/word/2010/wordprocessingGroup" xmlns:wpi="http://schemas.microsoft.com/office/word/2010/wordprocessingInk" xmlns:wne="http://schemas.microsoft.com/office/word/2006/wordml" xmlns:wps="http://schemas.microsoft.com/office/word/2010/wordprocessingShape" mc:Ignorable="w14 w15 w16se w16cid w16 w16cex w16sdtdh wp14">
   <w:abstractNum w:abstractNumId="0" w15:restartNumberingAfterBreak="0">
-    <w:nsid w:val="37FB4A9E"/>
+    <w:nsid w:val="4DB027CC"/>
     <w:multiLevelType w:val="hybridMultilevel"/>
-    <w:tmpl w:val="92E4D71E"/>
-    <w:lvl w:ilvl="0" w:tplc="1F1CF7FC">
+    <w:tmpl w:val="F3DE1F26"/>
+    <w:lvl w:ilvl="0" w:tplc="38D0F536">
       <w:start w:val="1"/>
       <w:numFmt w:val="bullet"/>
       <w:lvlText w:val="•"/>
@@ -6739,7 +6843,7 @@
         <w:ind w:left="720" w:hanging="360"/>
       </w:pPr>
     </w:lvl>
-    <w:lvl w:ilvl="1" w:tplc="4150EEE2">
+    <w:lvl w:ilvl="1" w:tplc="AEBCD51E">
       <w:start w:val="1"/>
       <w:numFmt w:val="bullet"/>
       <w:lvlText w:val="o"/>
@@ -6748,7 +6852,7 @@
         <w:ind w:left="1440" w:hanging="360"/>
       </w:pPr>
     </w:lvl>
-    <w:lvl w:ilvl="2" w:tplc="FD66D428">
+    <w:lvl w:ilvl="2" w:tplc="9D621F2A">
       <w:start w:val="1"/>
       <w:numFmt w:val="bullet"/>
       <w:lvlText w:val="▪"/>
@@ -6757,7 +6861,7 @@
         <w:ind w:left="2160" w:hanging="360"/>
       </w:pPr>
     </w:lvl>
-    <w:lvl w:ilvl="3" w:tplc="85F474E8">
+    <w:lvl w:ilvl="3" w:tplc="077809BC">
       <w:start w:val="1"/>
       <w:numFmt w:val="bullet"/>
       <w:lvlText w:val="•"/>
@@ -6766,7 +6870,7 @@
         <w:ind w:left="2880" w:hanging="360"/>
       </w:pPr>
     </w:lvl>
-    <w:lvl w:ilvl="4" w:tplc="8548BEE0">
+    <w:lvl w:ilvl="4" w:tplc="CA4C84DE">
       <w:start w:val="1"/>
       <w:numFmt w:val="bullet"/>
       <w:lvlText w:val="o"/>
@@ -6775,7 +6879,7 @@
         <w:ind w:left="3600" w:hanging="360"/>
       </w:pPr>
     </w:lvl>
-    <w:lvl w:ilvl="5" w:tplc="0BD2B884">
+    <w:lvl w:ilvl="5" w:tplc="C58AB56A">
       <w:start w:val="1"/>
       <w:numFmt w:val="bullet"/>
       <w:lvlText w:val="▪"/>
@@ -6784,7 +6888,7 @@
         <w:ind w:left="4320" w:hanging="360"/>
       </w:pPr>
     </w:lvl>
-    <w:lvl w:ilvl="6" w:tplc="42FC17B6">
+    <w:lvl w:ilvl="6" w:tplc="49C69050">
       <w:start w:val="1"/>
       <w:numFmt w:val="bullet"/>
       <w:lvlText w:val="•"/>
@@ -6793,7 +6897,7 @@
         <w:ind w:left="5040" w:hanging="360"/>
       </w:pPr>
     </w:lvl>
-    <w:lvl w:ilvl="7" w:tplc="FD7C220E">
+    <w:lvl w:ilvl="7" w:tplc="B86EFD8A">
       <w:start w:val="1"/>
       <w:numFmt w:val="bullet"/>
       <w:lvlText w:val="o"/>
@@ -6802,7 +6906,7 @@
         <w:ind w:left="5760" w:hanging="360"/>
       </w:pPr>
     </w:lvl>
-    <w:lvl w:ilvl="8" w:tplc="B9B4DC86">
+    <w:lvl w:ilvl="8" w:tplc="1E18F690">
       <w:start w:val="1"/>
       <w:numFmt w:val="bullet"/>
       <w:lvlText w:val="▪"/>
@@ -6813,10 +6917,10 @@
     </w:lvl>
   </w:abstractNum>
   <w:abstractNum w:abstractNumId="1" w15:restartNumberingAfterBreak="0">
-    <w:nsid w:val="5B0110FF"/>
+    <w:nsid w:val="55B831FC"/>
     <w:multiLevelType w:val="hybridMultilevel"/>
-    <w:tmpl w:val="99946F3E"/>
-    <w:lvl w:ilvl="0" w:tplc="08C26168">
+    <w:tmpl w:val="7CF42AC6"/>
+    <w:lvl w:ilvl="0" w:tplc="4C1666B4">
       <w:start w:val="1"/>
       <w:numFmt w:val="decimal"/>
       <w:lvlText w:val="%1."/>
@@ -6825,7 +6929,7 @@
         <w:ind w:left="720" w:hanging="360"/>
       </w:pPr>
     </w:lvl>
-    <w:lvl w:ilvl="1" w:tplc="60BEAF02">
+    <w:lvl w:ilvl="1" w:tplc="97BEBE74">
       <w:start w:val="1"/>
       <w:numFmt w:val="lowerLetter"/>
       <w:lvlText w:val="%2."/>
@@ -6834,7 +6938,7 @@
         <w:ind w:left="1440" w:hanging="360"/>
       </w:pPr>
     </w:lvl>
-    <w:lvl w:ilvl="2" w:tplc="73FAAA3C">
+    <w:lvl w:ilvl="2" w:tplc="E06C447C">
       <w:start w:val="1"/>
       <w:numFmt w:val="lowerRoman"/>
       <w:lvlText w:val="%3."/>
@@ -6843,7 +6947,7 @@
         <w:ind w:left="2160" w:hanging="360"/>
       </w:pPr>
     </w:lvl>
-    <w:lvl w:ilvl="3" w:tplc="462EAA5E">
+    <w:lvl w:ilvl="3" w:tplc="B67AD962">
       <w:start w:val="1"/>
       <w:numFmt w:val="decimal"/>
       <w:lvlText w:val="%4."/>
@@ -6852,7 +6956,7 @@
         <w:ind w:left="2880" w:hanging="360"/>
       </w:pPr>
     </w:lvl>
-    <w:lvl w:ilvl="4" w:tplc="53B0DBCA">
+    <w:lvl w:ilvl="4" w:tplc="1A080D06">
       <w:start w:val="1"/>
       <w:numFmt w:val="lowerLetter"/>
       <w:lvlText w:val="%5."/>
@@ -6861,7 +6965,7 @@
         <w:ind w:left="3600" w:hanging="360"/>
       </w:pPr>
     </w:lvl>
-    <w:lvl w:ilvl="5" w:tplc="75DCF658">
+    <w:lvl w:ilvl="5" w:tplc="E042DD54">
       <w:start w:val="1"/>
       <w:numFmt w:val="lowerRoman"/>
       <w:lvlText w:val="%6."/>
@@ -6870,7 +6974,7 @@
         <w:ind w:left="4320" w:hanging="360"/>
       </w:pPr>
     </w:lvl>
-    <w:lvl w:ilvl="6" w:tplc="4E72E5B0">
+    <w:lvl w:ilvl="6" w:tplc="9A7629D6">
       <w:start w:val="1"/>
       <w:numFmt w:val="decimal"/>
       <w:lvlText w:val="%7."/>
@@ -6879,7 +6983,7 @@
         <w:ind w:left="5040" w:hanging="360"/>
       </w:pPr>
     </w:lvl>
-    <w:lvl w:ilvl="7" w:tplc="56F0ABC6">
+    <w:lvl w:ilvl="7" w:tplc="73C6ECE8">
       <w:start w:val="1"/>
       <w:numFmt w:val="lowerLetter"/>
       <w:lvlText w:val="%8."/>
@@ -6888,7 +6992,7 @@
         <w:ind w:left="5760" w:hanging="360"/>
       </w:pPr>
     </w:lvl>
-    <w:lvl w:ilvl="8" w:tplc="5B8EE998">
+    <w:lvl w:ilvl="8" w:tplc="48184E18">
       <w:start w:val="1"/>
       <w:numFmt w:val="lowerRoman"/>
       <w:lvlText w:val="%9."/>

</xml_diff>

<commit_message>
Revisar el README completo y quitar los consejos sobre Supabase (T068)
Supabase nunca se probo: el README, .env.example, docker-compose.yml y quickstart
describen ahora la base local de Docker, que es la que se uso. Se agregan el
resultado de la evaluacion, la activacion del entorno en Windows y el comando de
carga del volcado, probado en una base aparte. El informe refleja las 68 tareas.

Co-Authored-By: Claude Opus 5.5 <noreply@anthropic.com>
</commit_message>
<xml_diff>
--- a/docs/informe/informe.docx
+++ b/docs/informe/informe.docx
@@ -855,7 +855,7 @@
                 <w:sz w:val="19"/>
                 <w:lang w:val="es-AR"/>
               </w:rPr>
-              <w:t>67 tareas</w:t>
+              <w:t>68 tareas</w:t>
             </w:r>
             <w:r>
               <w:rPr>
@@ -1060,7 +1060,7 @@
           <w:sz w:val="21"/>
           <w:lang w:val="es-AR"/>
         </w:rPr>
-        <w:t>T045 a T067</w:t>
+        <w:t>T045 a T068</w:t>
       </w:r>
       <w:r>
         <w:rPr>

</xml_diff>

<commit_message>
Correcciones del analisis de consistencia y evaluacion de 39 casos (T072 a T078)
speckit-analyze encontro 10 hallazgos y el autor decidio corregir todos.
- spec.md: escenarios de aceptacion que los datos no podian responder, entidad
  Area, numero de reintentos, aviso de error y SC-007 reescrito.
- Caso edge-04: el agente no contesta preguntas ajenas a la planta.
- Prueba automatica del manejo de cuota de la evaluacion.
- Sexta corrida: 39 de 39, tambien en el experimento de LangSmith.
- Informe, README, plan y research actualizados.

Co-Authored-By: Claude Opus 5.5 <noreply@anthropic.com>
</commit_message>
<xml_diff>
--- a/docs/informe/informe.docx
+++ b/docs/informe/informe.docx
@@ -855,7 +855,7 @@
                 <w:sz w:val="19"/>
                 <w:lang w:val="es-AR"/>
               </w:rPr>
-              <w:t>68 tareas</w:t>
+              <w:t>78 tareas</w:t>
             </w:r>
             <w:r>
               <w:rPr>
@@ -1060,7 +1060,7 @@
           <w:sz w:val="21"/>
           <w:lang w:val="es-AR"/>
         </w:rPr>
-        <w:t>T045 a T068</w:t>
+        <w:t>T045 a T078</w:t>
       </w:r>
       <w:r>
         <w:rPr>
@@ -1106,7 +1106,14 @@
           <w:sz w:val="21"/>
           <w:lang w:val="es-AR"/>
         </w:rPr>
-        <w:t xml:space="preserve"> La versión 1.0.0 exigía PostgreSQL en Supabase. Como todo se probó con el Postgres local de Docker, se enmendó a la versión 1.1.0 para admitir una base local o en la nube. El motivo quedó escrito en el mismo archivo.</w:t>
+        <w:t xml:space="preserve"> La versión 1.0.0 exigía PostgreSQL en Supabase. Como todo se probó con el Postgres local de Docker, se enmendó a la versión 1.1.0 para admitir una base local o en la nube. </w:t>
+      </w:r>
+      <w:r>
+        <w:rPr>
+          <w:sz w:val="21"/>
+          <w:lang w:val="es-AR"/>
+        </w:rPr>
+        <w:t>La versión 1.2.0 ajustó el principio de evaluación. El 12 de octubre el autor revisó la constitución e hizo las etapas de aclaración y de análisis de Spec Kit, que al inicio se habían salteado.</w:t>
       </w:r>
     </w:p>
     <w:p>
@@ -1270,25 +1277,34 @@
                 <w:sz w:val="19"/>
                 <w:lang w:val="es-AR"/>
               </w:rPr>
-              <w:t>Áreas de la planta (por ejemplo bombeo de agua)</w:t>
-            </w:r>
-          </w:p>
-        </w:tc>
-        <w:tc>
-          <w:tcPr>
-            <w:tcW w:w="3120" w:type="dxa"/>
-          </w:tcPr>
-          <w:p>
-            <w:pPr>
-              <w:spacing w:before="20" w:after="20" w:line="240" w:lineRule="auto"/>
-              <w:rPr>
-                <w:sz w:val="19"/>
-              </w:rPr>
-            </w:pPr>
-            <w:r>
-              <w:rPr>
-                <w:sz w:val="19"/>
-              </w:rPr>
+              <w:t xml:space="preserve">Áreas de la planta (por ejemplo </w:t>
+            </w:r>
+            <w:r>
+              <w:rPr>
+                <w:sz w:val="19"/>
+                <w:lang w:val="es-AR"/>
+              </w:rPr>
+              <w:lastRenderedPageBreak/>
+              <w:t>bombeo de agua)</w:t>
+            </w:r>
+          </w:p>
+        </w:tc>
+        <w:tc>
+          <w:tcPr>
+            <w:tcW w:w="3120" w:type="dxa"/>
+          </w:tcPr>
+          <w:p>
+            <w:pPr>
+              <w:spacing w:before="20" w:after="20" w:line="240" w:lineRule="auto"/>
+              <w:rPr>
+                <w:sz w:val="19"/>
+              </w:rPr>
+            </w:pPr>
+            <w:r>
+              <w:rPr>
+                <w:sz w:val="19"/>
+              </w:rPr>
+              <w:lastRenderedPageBreak/>
               <w:t>18</w:t>
             </w:r>
           </w:p>
@@ -1311,7 +1327,6 @@
                 <w:rStyle w:val="CodeChar"/>
                 <w:sz w:val="19"/>
               </w:rPr>
-              <w:lastRenderedPageBreak/>
               <w:t>tecnicos</w:t>
             </w:r>
           </w:p>
@@ -3427,7 +3442,21 @@
           <w:sz w:val="21"/>
           <w:lang w:val="es-AR"/>
         </w:rPr>
-        <w:t>Hay dos tipos de prueba. Las automáticas no usan el modelo real y no gastan cuota. La evaluación de 38 casos sí usa el modelo real y mide el comportamiento del agente.</w:t>
+        <w:t xml:space="preserve">Hay dos tipos de prueba. Las automáticas no usan el modelo real y no gastan cuota. </w:t>
+      </w:r>
+      <w:r>
+        <w:rPr>
+          <w:sz w:val="21"/>
+          <w:lang w:val="es-AR"/>
+        </w:rPr>
+        <w:t>La evaluación de 39 casos sí usa</w:t>
+      </w:r>
+      <w:r>
+        <w:rPr>
+          <w:sz w:val="21"/>
+          <w:lang w:val="es-AR"/>
+        </w:rPr>
+        <w:t xml:space="preserve"> el modelo real y mide el comportamiento del agente.</w:t>
       </w:r>
     </w:p>
     <w:p>
@@ -3468,7 +3497,35 @@
           <w:sz w:val="21"/>
           <w:lang w:val="es-AR"/>
         </w:rPr>
-        <w:t>. Son 94 y pasaron todas en la última corrida. Usan un modelo falso con respuestas guionadas, así que prueban la lógica del sistema y no la calidad de Gemini. Cubren el validador de SQL (30 pruebas), el rol de solo lectura contra una base real (10), la integridad de los datos (10), las rutas del grafo y los caminos de datos y documentos (23), el evaluador (11), la fragmentación y los embeddings (6) y la interfaz (4).</w:t>
+        <w:t xml:space="preserve">. </w:t>
+      </w:r>
+      <w:r>
+        <w:rPr>
+          <w:sz w:val="21"/>
+          <w:lang w:val="es-AR"/>
+        </w:rPr>
+        <w:t>Son 98 y pasaron</w:t>
+      </w:r>
+      <w:r>
+        <w:rPr>
+          <w:sz w:val="21"/>
+          <w:lang w:val="es-AR"/>
+        </w:rPr>
+        <w:t xml:space="preserve"> todas en la última corrida. Usan un modelo falso con respuestas guionadas, así que prueban la lógica del sistema y no la calidad de Gemini. Cubren el validador de SQL (30 pruebas), el rol de solo lectura contra una base real (10), la integridad de los datos (10), las rutas del grafo y los caminos de datos y documentos (23), </w:t>
+      </w:r>
+      <w:r>
+        <w:rPr>
+          <w:sz w:val="21"/>
+          <w:lang w:val="es-AR"/>
+        </w:rPr>
+        <w:t>el evaluador (15)</w:t>
+      </w:r>
+      <w:r>
+        <w:rPr>
+          <w:sz w:val="21"/>
+          <w:lang w:val="es-AR"/>
+        </w:rPr>
+        <w:t>, la fragmentación y los embeddings (6) y la interfaz (4).</w:t>
       </w:r>
     </w:p>
     <w:p>
@@ -3501,7 +3558,7 @@
           <w:sz w:val="21"/>
           <w:lang w:val="es-AR"/>
         </w:rPr>
-        <w:t>Evaluación de 38 casos (</w:t>
+        <w:t>Evaluación de 39 casos (</w:t>
       </w:r>
       <w:r>
         <w:rPr>
@@ -3540,7 +3597,21 @@
           <w:sz w:val="21"/>
           <w:lang w:val="es-AR"/>
         </w:rPr>
-        <w:t>: 15 de datos, 7 de documentos, 3 combinados, 4 pedidos de escritura que deben rechazarse, 3 sin respaldo en ninguna fuente, 2 que no necesitan fuente, 3 casos borde (equipo que no existe, pregunta ambigua, resultado recortado) y 1 de seguimiento.</w:t>
+        <w:t xml:space="preserve">: 15 de datos, 7 de documentos, 3 combinados, 4 pedidos de escritura que deben rechazarse, 3 sin respaldo en ninguna fuente, 2 que no necesitan fuente, </w:t>
+      </w:r>
+      <w:r>
+        <w:rPr>
+          <w:sz w:val="21"/>
+          <w:lang w:val="es-AR"/>
+        </w:rPr>
+        <w:t>4 casos borde (equipo que no existe, pregunta ambigua, resultado recortado, pregunta ajena a la planta)</w:t>
+      </w:r>
+      <w:r>
+        <w:rPr>
+          <w:sz w:val="21"/>
+          <w:lang w:val="es-AR"/>
+        </w:rPr>
+        <w:t xml:space="preserve"> y 1 de seguimiento.</w:t>
       </w:r>
     </w:p>
     <w:p>
@@ -3595,7 +3666,21 @@
           <w:sz w:val="21"/>
           <w:lang w:val="es-AR"/>
         </w:rPr>
-        <w:t xml:space="preserve"> La evaluación se corrió cinco veces entre el 10 y el 12 de octubre de 2026. La última dio 38 de 38 casos con </w:t>
+        <w:t xml:space="preserve"> La evaluación </w:t>
+      </w:r>
+      <w:r>
+        <w:rPr>
+          <w:sz w:val="21"/>
+          <w:lang w:val="es-AR"/>
+        </w:rPr>
+        <w:t>se corrió seis veces entre el 10 y el 12 de octubre de 2026. La última dio 39 de 39 casos</w:t>
+      </w:r>
+      <w:r>
+        <w:rPr>
+          <w:sz w:val="21"/>
+          <w:lang w:val="es-AR"/>
+        </w:rPr>
+        <w:t xml:space="preserve"> con </w:t>
       </w:r>
       <w:r>
         <w:rPr>
@@ -3828,7 +3913,15 @@
                 <w:rStyle w:val="CodeChar"/>
                 <w:sz w:val="19"/>
               </w:rPr>
-              <w:t>gemini-3.5-flash-lite</w:t>
+              <w:t>gemini-3.5-flash-</w:t>
+            </w:r>
+            <w:r>
+              <w:rPr>
+                <w:rStyle w:val="CodeChar"/>
+                <w:sz w:val="19"/>
+              </w:rPr>
+              <w:lastRenderedPageBreak/>
+              <w:t>lite</w:t>
             </w:r>
           </w:p>
         </w:tc>
@@ -3847,6 +3940,7 @@
               <w:rPr>
                 <w:sz w:val="19"/>
               </w:rPr>
+              <w:lastRenderedPageBreak/>
               <w:t>22 de 35</w:t>
             </w:r>
           </w:p>
@@ -3868,7 +3962,15 @@
                 <w:sz w:val="19"/>
                 <w:lang w:val="es-AR"/>
               </w:rPr>
-              <w:t>La ingesta había guardado 2 fragmentos en vez de 18</w:t>
+              <w:t xml:space="preserve">La ingesta había guardado </w:t>
+            </w:r>
+            <w:r>
+              <w:rPr>
+                <w:sz w:val="19"/>
+                <w:lang w:val="es-AR"/>
+              </w:rPr>
+              <w:lastRenderedPageBreak/>
+              <w:t>2 fragmentos en vez de 18</w:t>
             </w:r>
           </w:p>
         </w:tc>
@@ -4121,6 +4223,86 @@
           </w:p>
         </w:tc>
       </w:tr>
+      <w:tr>
+        <w:tc>
+          <w:tcPr>
+            <w:tcW w:w="2340" w:type="dxa"/>
+          </w:tcPr>
+          <w:p>
+            <w:pPr>
+              <w:spacing w:before="20" w:after="20" w:line="240" w:lineRule="auto"/>
+              <w:rPr>
+                <w:sz w:val="19"/>
+              </w:rPr>
+            </w:pPr>
+            <w:r>
+              <w:rPr>
+                <w:sz w:val="19"/>
+              </w:rPr>
+              <w:t>6</w:t>
+            </w:r>
+          </w:p>
+        </w:tc>
+        <w:tc>
+          <w:tcPr>
+            <w:tcW w:w="2340" w:type="dxa"/>
+          </w:tcPr>
+          <w:p>
+            <w:pPr>
+              <w:spacing w:before="20" w:after="20" w:line="240" w:lineRule="auto"/>
+              <w:rPr>
+                <w:sz w:val="19"/>
+              </w:rPr>
+            </w:pPr>
+            <w:r>
+              <w:rPr>
+                <w:sz w:val="19"/>
+              </w:rPr>
+              <w:t>gemini-3.5-flash-lite</w:t>
+            </w:r>
+          </w:p>
+        </w:tc>
+        <w:tc>
+          <w:tcPr>
+            <w:tcW w:w="2340" w:type="dxa"/>
+          </w:tcPr>
+          <w:p>
+            <w:pPr>
+              <w:spacing w:before="20" w:after="20" w:line="240" w:lineRule="auto"/>
+              <w:rPr>
+                <w:sz w:val="19"/>
+              </w:rPr>
+            </w:pPr>
+            <w:r>
+              <w:rPr>
+                <w:sz w:val="19"/>
+              </w:rPr>
+              <w:t>39 de 39</w:t>
+            </w:r>
+          </w:p>
+        </w:tc>
+        <w:tc>
+          <w:tcPr>
+            <w:tcW w:w="2340" w:type="dxa"/>
+          </w:tcPr>
+          <w:p>
+            <w:pPr>
+              <w:spacing w:before="20" w:after="20" w:line="240" w:lineRule="auto"/>
+              <w:rPr>
+                <w:sz w:val="19"/>
+                <w:lang w:val="es-AR"/>
+              </w:rPr>
+            </w:pPr>
+            <w:r>
+              <w:rPr>
+                <w:sz w:val="19"/>
+                <w:lang w:val="es-AR"/>
+              </w:rPr>
+              <w:t>Se sumó un caso de pregunta ajena a la planta, tras la revisión del proceso</w:t>
+            </w:r>
+          </w:p>
+        </w:tc>
+      </w:tr>
     </w:tbl>
     <w:p>
       <w:pPr>
@@ -4136,7 +4318,7 @@
           <w:sz w:val="21"/>
           <w:lang w:val="es-AR"/>
         </w:rPr>
-        <w:t>Criterios de éxito en la corrida 5</w:t>
+        <w:t>Criterios de éxito en la corrida 6</w:t>
       </w:r>
       <w:r>
         <w:rPr>
@@ -4151,7 +4333,15 @@
           <w:sz w:val="21"/>
           <w:lang w:val="es-AR"/>
         </w:rPr>
-        <w:t>eval/results/20261012-163749.json</w:t>
+        <w:t>eval/results/</w:t>
+      </w:r>
+      <w:r>
+        <w:rPr>
+          <w:rStyle w:val="CodeChar"/>
+          <w:sz w:val="21"/>
+          <w:lang w:val="es-AR"/>
+        </w:rPr>
+        <w:t>20261012-203031.json</w:t>
       </w:r>
       <w:r>
         <w:rPr>
@@ -4292,7 +4482,7 @@
               <w:rPr>
                 <w:sz w:val="19"/>
               </w:rPr>
-              <w:t>100% (38 de 38)</w:t>
+              <w:t>100% (39 de 39)</w:t>
             </w:r>
           </w:p>
         </w:tc>
@@ -4597,7 +4787,7 @@
               <w:rPr>
                 <w:sz w:val="19"/>
               </w:rPr>
-              <w:t>4,6 s (mediana 3,1 s)</w:t>
+              <w:t>3,6 s (mediana 2,6 s)</w:t>
             </w:r>
           </w:p>
         </w:tc>
@@ -5361,7 +5551,15 @@
                 <w:sz w:val="19"/>
                 <w:lang w:val="es-AR"/>
               </w:rPr>
-              <w:t>El valor máximo de temperatura registrado en el motor M-301 fue de 105.44.</w:t>
+              <w:t xml:space="preserve">El valor máximo de temperatura registrado en el motor M-301 fue de </w:t>
+            </w:r>
+            <w:r>
+              <w:rPr>
+                <w:sz w:val="19"/>
+                <w:lang w:val="es-AR"/>
+              </w:rPr>
+              <w:lastRenderedPageBreak/>
+              <w:t>105.44.</w:t>
             </w:r>
           </w:p>
         </w:tc>
@@ -5384,6 +5582,7 @@
                 <w:sz w:val="19"/>
                 <w:lang w:val="es-AR"/>
               </w:rPr>
+              <w:lastRenderedPageBreak/>
               <w:t>¿Cuántas alarmas críticas hubo en el área Bombeo de agua?</w:t>
             </w:r>
           </w:p>
@@ -5466,7 +5665,6 @@
                 <w:sz w:val="19"/>
                 <w:lang w:val="es-AR"/>
               </w:rPr>
-              <w:lastRenderedPageBreak/>
               <w:t>¿Cada cuánto se lubrican los rodamientos de un motor eléctrico?</w:t>
             </w:r>
           </w:p>
@@ -5936,6 +6134,7 @@
           <w:noProof/>
           <w:sz w:val="21"/>
         </w:rPr>
+        <w:lastRenderedPageBreak/>
         <w:drawing>
           <wp:inline distT="0" distB="0" distL="0" distR="0" wp14:anchorId="383ABE1E" wp14:editId="628F97A9">
             <wp:extent cx="4445000" cy="2778125"/>
@@ -6002,7 +6201,6 @@
           <w:noProof/>
           <w:sz w:val="21"/>
         </w:rPr>
-        <w:lastRenderedPageBreak/>
         <w:drawing>
           <wp:inline distT="0" distB="0" distL="0" distR="0" wp14:anchorId="46D1EE07" wp14:editId="39BA101A">
             <wp:extent cx="4445000" cy="2778125"/>
@@ -6213,6 +6411,7 @@
           <w:noProof/>
           <w:sz w:val="21"/>
         </w:rPr>
+        <w:lastRenderedPageBreak/>
         <w:drawing>
           <wp:inline distT="0" distB="0" distL="0" distR="0" wp14:anchorId="26BF4554" wp14:editId="320889E4">
             <wp:extent cx="4445000" cy="3028717"/>
@@ -6271,7 +6470,21 @@
           <w:sz w:val="21"/>
           <w:lang w:val="es-AR"/>
         </w:rPr>
-        <w:t xml:space="preserve"> Los 38 casos se subieron como conjunto de datos (</w:t>
+        <w:t xml:space="preserve"> </w:t>
+      </w:r>
+      <w:r>
+        <w:rPr>
+          <w:sz w:val="21"/>
+          <w:lang w:val="es-AR"/>
+        </w:rPr>
+        <w:t>Los 39 casos se subieron</w:t>
+      </w:r>
+      <w:r>
+        <w:rPr>
+          <w:sz w:val="21"/>
+          <w:lang w:val="es-AR"/>
+        </w:rPr>
+        <w:t xml:space="preserve"> como conjunto de datos (</w:t>
       </w:r>
       <w:r>
         <w:rPr>
@@ -6301,7 +6514,21 @@
           <w:sz w:val="21"/>
           <w:lang w:val="es-AR"/>
         </w:rPr>
-        <w:t>). Resultado del 12 de octubre de 2026: 38 de 38 casos aprobados.</w:t>
+        <w:t xml:space="preserve">). Resultado del 12 de octubre de 2026: </w:t>
+      </w:r>
+      <w:r>
+        <w:rPr>
+          <w:sz w:val="21"/>
+          <w:lang w:val="es-AR"/>
+        </w:rPr>
+        <w:t>39 de 39 casos aprobados</w:t>
+      </w:r>
+      <w:r>
+        <w:rPr>
+          <w:sz w:val="21"/>
+          <w:lang w:val="es-AR"/>
+        </w:rPr>
+        <w:t>.</w:t>
       </w:r>
     </w:p>
     <w:p>
@@ -6429,34 +6656,25 @@
                 <w:sz w:val="19"/>
                 <w:lang w:val="es-AR"/>
               </w:rPr>
-              <w:t xml:space="preserve">Base relacional con al menos 5 tablas </w:t>
-            </w:r>
-            <w:r>
-              <w:rPr>
-                <w:sz w:val="19"/>
-                <w:lang w:val="es-AR"/>
-              </w:rPr>
-              <w:lastRenderedPageBreak/>
-              <w:t>y más de 15 filas por tabla</w:t>
-            </w:r>
-          </w:p>
-        </w:tc>
-        <w:tc>
-          <w:tcPr>
-            <w:tcW w:w="3120" w:type="dxa"/>
-          </w:tcPr>
-          <w:p>
-            <w:pPr>
-              <w:spacing w:before="20" w:after="20" w:line="240" w:lineRule="auto"/>
-              <w:rPr>
-                <w:sz w:val="19"/>
-              </w:rPr>
-            </w:pPr>
-            <w:r>
-              <w:rPr>
-                <w:sz w:val="19"/>
-              </w:rPr>
-              <w:lastRenderedPageBreak/>
+              <w:t>Base relacional con al menos 5 tablas y más de 15 filas por tabla</w:t>
+            </w:r>
+          </w:p>
+        </w:tc>
+        <w:tc>
+          <w:tcPr>
+            <w:tcW w:w="3120" w:type="dxa"/>
+          </w:tcPr>
+          <w:p>
+            <w:pPr>
+              <w:spacing w:before="20" w:after="20" w:line="240" w:lineRule="auto"/>
+              <w:rPr>
+                <w:sz w:val="19"/>
+              </w:rPr>
+            </w:pPr>
+            <w:r>
+              <w:rPr>
+                <w:sz w:val="19"/>
+              </w:rPr>
               <w:t>Cumplido</w:t>
             </w:r>
           </w:p>
@@ -6478,15 +6696,7 @@
                 <w:sz w:val="19"/>
                 <w:lang w:val="es-AR"/>
               </w:rPr>
-              <w:t xml:space="preserve">7 tablas, de 18 a 38.880 filas (pruebas </w:t>
-            </w:r>
-            <w:r>
-              <w:rPr>
-                <w:sz w:val="19"/>
-                <w:lang w:val="es-AR"/>
-              </w:rPr>
-              <w:lastRenderedPageBreak/>
-              <w:t>de integridad del seed)</w:t>
+              <w:t>7 tablas, de 18 a 38.880 filas (pruebas de integridad del seed)</w:t>
             </w:r>
           </w:p>
         </w:tc>
@@ -6509,7 +6719,6 @@
                 <w:sz w:val="19"/>
                 <w:lang w:val="es-AR"/>
               </w:rPr>
-              <w:lastRenderedPageBreak/>
               <w:t>Al menos 2 PDF para RAG</w:t>
             </w:r>
           </w:p>
@@ -6613,7 +6822,14 @@
                 <w:sz w:val="19"/>
                 <w:lang w:val="es-AR"/>
               </w:rPr>
-              <w:t>Pruebas de ruteo y evaluación con Gemini: fuente correcta en el 100% de los casos de las corridas 4 y 5</w:t>
+              <w:t xml:space="preserve">Pruebas de ruteo y evaluación con Gemini: fuente correcta en el 100% de los casos </w:t>
+            </w:r>
+            <w:r>
+              <w:rPr>
+                <w:sz w:val="19"/>
+                <w:lang w:val="es-AR"/>
+              </w:rPr>
+              <w:t>de las corridas 4, 5 y 6</w:t>
             </w:r>
           </w:p>
         </w:tc>
@@ -6735,7 +6951,7 @@
                 <w:sz w:val="19"/>
                 <w:lang w:val="es-AR"/>
               </w:rPr>
-              <w:t>9 páginas con portada</w:t>
+              <w:t>10 páginas con portada</w:t>
             </w:r>
             <w:r>
               <w:rPr>
@@ -7212,6 +7428,7 @@
           <w:b/>
           <w:sz w:val="21"/>
         </w:rPr>
+        <w:lastRenderedPageBreak/>
         <w:t>Limitaciones</w:t>
       </w:r>
     </w:p>
@@ -7240,13 +7457,20 @@
           <w:sz w:val="21"/>
           <w:lang w:val="es-AR"/>
         </w:rPr>
-        <w:t xml:space="preserve"> El modelo no redacta siempre igual: un caso que aprobó en la corrida 2 falló en la 3 por cómo escribió la respuesta. El 38 de 38 es el resultado de una corrida, no una garantía. </w:t>
-      </w:r>
-      <w:r>
-        <w:rPr>
-          <w:sz w:val="21"/>
-        </w:rPr>
-        <w:t>Además, 38 casos son una muestra chica.</w:t>
+        <w:t xml:space="preserve"> El modelo no redacta siempre igual: un caso que aprobó en la corrida 2 falló en la 3 por cómo escribió la respuesta. </w:t>
+      </w:r>
+      <w:r>
+        <w:rPr>
+          <w:sz w:val="21"/>
+          <w:lang w:val="es-AR"/>
+        </w:rPr>
+        <w:t>El 39 de 39 es el resultado de una corrida, no una garantía. Además, 39 casos</w:t>
+      </w:r>
+      <w:r>
+        <w:rPr>
+          <w:sz w:val="21"/>
+        </w:rPr>
+        <w:t xml:space="preserve"> son una muestra chica.</w:t>
       </w:r>
     </w:p>
     <w:p>

</xml_diff>

<commit_message>
Guia de los datos y de la demostracion (T079)
Contenido real de cada tabla y de cada PDF, y preguntas probadas con el modelo
real. tasks.md registra el repaso de las decisiones del plan con el autor.

Co-Authored-By: Claude Opus 5.5 <noreply@anthropic.com>
</commit_message>
<xml_diff>
--- a/docs/informe/informe.docx
+++ b/docs/informe/informe.docx
@@ -855,7 +855,7 @@
                 <w:sz w:val="19"/>
                 <w:lang w:val="es-AR"/>
               </w:rPr>
-              <w:t>78 tareas</w:t>
+              <w:t>79 tareas</w:t>
             </w:r>
             <w:r>
               <w:rPr>
@@ -1060,7 +1060,7 @@
           <w:sz w:val="21"/>
           <w:lang w:val="es-AR"/>
         </w:rPr>
-        <w:t>T045 a T078</w:t>
+        <w:t>T045 a T079</w:t>
       </w:r>
       <w:r>
         <w:rPr>

</xml_diff>

<commit_message>
Tres comportamientos nuevos por decision del autor: periodo sin datos, unidad y evolucion por dia (T080 a T085)
Flujo de Spec Kit: requisitos FR-017 a FR-019 en spec.md, speckit-converge para
derivar las tareas y speckit-implement para hacerlas.
- El agente aclara que periodo cubren los datos cuando la pregunta cae fuera.
- Las respuestas con valores medidos incluyen la unidad.
- Los pedidos de evolucion se responden con promedio y maximo por dia.
- Tres casos de evaluacion nuevos; los 39 anteriores no cambian.
- Evaluacion: 42 de 42 en dos corridas. Experimento de LangSmith: 41 de 42.
- Se quita .claude/launch.json, que ningun artefacto pedia.

Co-Authored-By: Claude Opus 5.5 <noreply@anthropic.com>
</commit_message>
<xml_diff>
--- a/docs/informe/informe.docx
+++ b/docs/informe/informe.docx
@@ -679,7 +679,21 @@
                 <w:sz w:val="19"/>
                 <w:lang w:val="es-AR"/>
               </w:rPr>
-              <w:t>5 historias de usuario, 16 requisitos y 8 criterios de éxito</w:t>
+              <w:t xml:space="preserve">5 historias de usuario, </w:t>
+            </w:r>
+            <w:r>
+              <w:rPr>
+                <w:sz w:val="19"/>
+                <w:lang w:val="es-AR"/>
+              </w:rPr>
+              <w:t>19 requisitos</w:t>
+            </w:r>
+            <w:r>
+              <w:rPr>
+                <w:sz w:val="19"/>
+                <w:lang w:val="es-AR"/>
+              </w:rPr>
+              <w:t xml:space="preserve"> y 8 criterios de éxito</w:t>
             </w:r>
           </w:p>
         </w:tc>
@@ -855,7 +869,7 @@
                 <w:sz w:val="19"/>
                 <w:lang w:val="es-AR"/>
               </w:rPr>
-              <w:t>79 tareas</w:t>
+              <w:t>85 tareas</w:t>
             </w:r>
             <w:r>
               <w:rPr>
@@ -1060,7 +1074,7 @@
           <w:sz w:val="21"/>
           <w:lang w:val="es-AR"/>
         </w:rPr>
-        <w:t>T045 a T079</w:t>
+        <w:t>T045 a T085</w:t>
       </w:r>
       <w:r>
         <w:rPr>
@@ -3449,7 +3463,7 @@
           <w:sz w:val="21"/>
           <w:lang w:val="es-AR"/>
         </w:rPr>
-        <w:t>La evaluación de 39 casos sí usa</w:t>
+        <w:t>La evaluación de 42 casos sí usa</w:t>
       </w:r>
       <w:r>
         <w:rPr>
@@ -3504,21 +3518,35 @@
           <w:sz w:val="21"/>
           <w:lang w:val="es-AR"/>
         </w:rPr>
-        <w:t>Son 98 y pasaron</w:t>
-      </w:r>
-      <w:r>
-        <w:rPr>
-          <w:sz w:val="21"/>
-          <w:lang w:val="es-AR"/>
-        </w:rPr>
-        <w:t xml:space="preserve"> todas en la última corrida. Usan un modelo falso con respuestas guionadas, así que prueban la lógica del sistema y no la calidad de Gemini. Cubren el validador de SQL (30 pruebas), el rol de solo lectura contra una base real (10), la integridad de los datos (10), las rutas del grafo y los caminos de datos y documentos (23), </w:t>
-      </w:r>
-      <w:r>
-        <w:rPr>
-          <w:sz w:val="21"/>
-          <w:lang w:val="es-AR"/>
-        </w:rPr>
-        <w:t>el evaluador (15)</w:t>
+        <w:t>Son 100 y pasaron</w:t>
+      </w:r>
+      <w:r>
+        <w:rPr>
+          <w:sz w:val="21"/>
+          <w:lang w:val="es-AR"/>
+        </w:rPr>
+        <w:t xml:space="preserve"> todas en la última corrida. Usan un modelo falso con respuestas guionadas, así que prueban la lógica del sistema y no la calidad de Gemini. Cubren el validador de SQL (30 pruebas), el rol de solo lectura contra una base real (10), la integridad de los datos (10), las rutas del grafo y los </w:t>
+      </w:r>
+      <w:r>
+        <w:rPr>
+          <w:sz w:val="21"/>
+          <w:lang w:val="es-AR"/>
+        </w:rPr>
+        <w:t>caminos de datos y documentos (24)</w:t>
+      </w:r>
+      <w:r>
+        <w:rPr>
+          <w:sz w:val="21"/>
+          <w:lang w:val="es-AR"/>
+        </w:rPr>
+        <w:t xml:space="preserve">, </w:t>
+      </w:r>
+      <w:r>
+        <w:rPr>
+          <w:sz w:val="21"/>
+          <w:lang w:val="es-AR"/>
+        </w:rPr>
+        <w:t>el evaluador (16)</w:t>
       </w:r>
       <w:r>
         <w:rPr>
@@ -3558,7 +3586,7 @@
           <w:sz w:val="21"/>
           <w:lang w:val="es-AR"/>
         </w:rPr>
-        <w:t>Evaluación de 39 casos (</w:t>
+        <w:t>Evaluación de 42 casos (</w:t>
       </w:r>
       <w:r>
         <w:rPr>
@@ -3604,7 +3632,7 @@
           <w:sz w:val="21"/>
           <w:lang w:val="es-AR"/>
         </w:rPr>
-        <w:t>4 casos borde (equipo que no existe, pregunta ambigua, resultado recortado, pregunta ajena a la planta)</w:t>
+        <w:t>7 casos borde (equipo inexistente, pregunta ambigua o ajena a la planta, resultado recortado, período sin datos, unidad de medida y evolución por día)</w:t>
       </w:r>
       <w:r>
         <w:rPr>
@@ -3673,7 +3701,7 @@
           <w:sz w:val="21"/>
           <w:lang w:val="es-AR"/>
         </w:rPr>
-        <w:t>se corrió seis veces entre el 10 y el 12 de octubre de 2026. La última dio 39 de 39 casos</w:t>
+        <w:t>se corrió ocho veces entre el 10 y el 13 de octubre de 2026. La última dio 42 de 42 casos</w:t>
       </w:r>
       <w:r>
         <w:rPr>
@@ -4303,6 +4331,166 @@
           </w:p>
         </w:tc>
       </w:tr>
+      <w:tr>
+        <w:tc>
+          <w:tcPr>
+            <w:tcW w:w="2340" w:type="dxa"/>
+          </w:tcPr>
+          <w:p>
+            <w:pPr>
+              <w:spacing w:before="20" w:after="20" w:line="240" w:lineRule="auto"/>
+              <w:rPr>
+                <w:sz w:val="19"/>
+              </w:rPr>
+            </w:pPr>
+            <w:r>
+              <w:rPr>
+                <w:sz w:val="19"/>
+              </w:rPr>
+              <w:t>7</w:t>
+            </w:r>
+          </w:p>
+        </w:tc>
+        <w:tc>
+          <w:tcPr>
+            <w:tcW w:w="2340" w:type="dxa"/>
+          </w:tcPr>
+          <w:p>
+            <w:pPr>
+              <w:spacing w:before="20" w:after="20" w:line="240" w:lineRule="auto"/>
+              <w:rPr>
+                <w:sz w:val="19"/>
+              </w:rPr>
+            </w:pPr>
+            <w:r>
+              <w:rPr>
+                <w:sz w:val="19"/>
+              </w:rPr>
+              <w:t>gemini-3.5-flash-lite</w:t>
+            </w:r>
+          </w:p>
+        </w:tc>
+        <w:tc>
+          <w:tcPr>
+            <w:tcW w:w="2340" w:type="dxa"/>
+          </w:tcPr>
+          <w:p>
+            <w:pPr>
+              <w:spacing w:before="20" w:after="20" w:line="240" w:lineRule="auto"/>
+              <w:rPr>
+                <w:sz w:val="19"/>
+              </w:rPr>
+            </w:pPr>
+            <w:r>
+              <w:rPr>
+                <w:sz w:val="19"/>
+              </w:rPr>
+              <w:t>42 de 42</w:t>
+            </w:r>
+          </w:p>
+        </w:tc>
+        <w:tc>
+          <w:tcPr>
+            <w:tcW w:w="2340" w:type="dxa"/>
+          </w:tcPr>
+          <w:p>
+            <w:pPr>
+              <w:spacing w:before="20" w:after="20" w:line="240" w:lineRule="auto"/>
+              <w:rPr>
+                <w:sz w:val="19"/>
+                <w:lang w:val="es-AR"/>
+              </w:rPr>
+            </w:pPr>
+            <w:r>
+              <w:rPr>
+                <w:sz w:val="19"/>
+                <w:lang w:val="es-AR"/>
+              </w:rPr>
+              <w:t>Tres comportamientos nuevos: período sin datos, unidad y evolución por día. El servicio respondió lento: percentil 90 de 17,6 s</w:t>
+            </w:r>
+          </w:p>
+        </w:tc>
+      </w:tr>
+      <w:tr>
+        <w:tc>
+          <w:tcPr>
+            <w:tcW w:w="2340" w:type="dxa"/>
+          </w:tcPr>
+          <w:p>
+            <w:pPr>
+              <w:spacing w:before="20" w:after="20" w:line="240" w:lineRule="auto"/>
+              <w:rPr>
+                <w:sz w:val="19"/>
+              </w:rPr>
+            </w:pPr>
+            <w:r>
+              <w:rPr>
+                <w:sz w:val="19"/>
+              </w:rPr>
+              <w:t>8</w:t>
+            </w:r>
+          </w:p>
+        </w:tc>
+        <w:tc>
+          <w:tcPr>
+            <w:tcW w:w="2340" w:type="dxa"/>
+          </w:tcPr>
+          <w:p>
+            <w:pPr>
+              <w:spacing w:before="20" w:after="20" w:line="240" w:lineRule="auto"/>
+              <w:rPr>
+                <w:sz w:val="19"/>
+              </w:rPr>
+            </w:pPr>
+            <w:r>
+              <w:rPr>
+                <w:sz w:val="19"/>
+              </w:rPr>
+              <w:t>gemini-3.5-flash-lite</w:t>
+            </w:r>
+          </w:p>
+        </w:tc>
+        <w:tc>
+          <w:tcPr>
+            <w:tcW w:w="2340" w:type="dxa"/>
+          </w:tcPr>
+          <w:p>
+            <w:pPr>
+              <w:spacing w:before="20" w:after="20" w:line="240" w:lineRule="auto"/>
+              <w:rPr>
+                <w:sz w:val="19"/>
+              </w:rPr>
+            </w:pPr>
+            <w:r>
+              <w:rPr>
+                <w:sz w:val="19"/>
+              </w:rPr>
+              <w:t>42 de 42</w:t>
+            </w:r>
+          </w:p>
+        </w:tc>
+        <w:tc>
+          <w:tcPr>
+            <w:tcW w:w="2340" w:type="dxa"/>
+          </w:tcPr>
+          <w:p>
+            <w:pPr>
+              <w:spacing w:before="20" w:after="20" w:line="240" w:lineRule="auto"/>
+              <w:rPr>
+                <w:sz w:val="19"/>
+                <w:lang w:val="es-AR"/>
+              </w:rPr>
+            </w:pPr>
+            <w:r>
+              <w:rPr>
+                <w:sz w:val="19"/>
+                <w:lang w:val="es-AR"/>
+              </w:rPr>
+              <w:t>Repetición con tiempos normales: percentil 90 de 4,8 s</w:t>
+            </w:r>
+          </w:p>
+        </w:tc>
+      </w:tr>
     </w:tbl>
     <w:p>
       <w:pPr>
@@ -4318,7 +4506,7 @@
           <w:sz w:val="21"/>
           <w:lang w:val="es-AR"/>
         </w:rPr>
-        <w:t>Criterios de éxito en la corrida 6</w:t>
+        <w:t>Criterios de éxito en la corrida 8</w:t>
       </w:r>
       <w:r>
         <w:rPr>
@@ -4341,7 +4529,7 @@
           <w:sz w:val="21"/>
           <w:lang w:val="es-AR"/>
         </w:rPr>
-        <w:t>20261012-203031.json</w:t>
+        <w:t>20261013-205335.json</w:t>
       </w:r>
       <w:r>
         <w:rPr>
@@ -4482,7 +4670,7 @@
               <w:rPr>
                 <w:sz w:val="19"/>
               </w:rPr>
-              <w:t>100% (39 de 39)</w:t>
+              <w:t>100% (42 de 42)</w:t>
             </w:r>
           </w:p>
         </w:tc>
@@ -4787,7 +4975,7 @@
               <w:rPr>
                 <w:sz w:val="19"/>
               </w:rPr>
-              <w:t>3,6 s (mediana 2,6 s)</w:t>
+              <w:t>4,8 s (mediana 3,3 s)</w:t>
             </w:r>
           </w:p>
         </w:tc>
@@ -5260,6 +5448,7 @@
         <w:rPr>
           <w:lang w:val="es-AR"/>
         </w:rPr>
+        <w:lastRenderedPageBreak/>
         <w:t>Ejemplos de consultas y evidencias</w:t>
       </w:r>
     </w:p>
@@ -5551,15 +5740,7 @@
                 <w:sz w:val="19"/>
                 <w:lang w:val="es-AR"/>
               </w:rPr>
-              <w:t xml:space="preserve">El valor máximo de temperatura registrado en el motor M-301 fue de </w:t>
-            </w:r>
-            <w:r>
-              <w:rPr>
-                <w:sz w:val="19"/>
-                <w:lang w:val="es-AR"/>
-              </w:rPr>
-              <w:lastRenderedPageBreak/>
-              <w:t>105.44.</w:t>
+              <w:t>El valor máximo de temperatura registrado en el motor M-301 fue de 105.44.</w:t>
             </w:r>
           </w:p>
         </w:tc>
@@ -5582,7 +5763,6 @@
                 <w:sz w:val="19"/>
                 <w:lang w:val="es-AR"/>
               </w:rPr>
-              <w:lastRenderedPageBreak/>
               <w:t>¿Cuántas alarmas críticas hubo en el área Bombeo de agua?</w:t>
             </w:r>
           </w:p>
@@ -6477,7 +6657,7 @@
           <w:sz w:val="21"/>
           <w:lang w:val="es-AR"/>
         </w:rPr>
-        <w:t>Los 39 casos se subieron</w:t>
+        <w:t>Los 42 casos se subieron</w:t>
       </w:r>
       <w:r>
         <w:rPr>
@@ -6514,21 +6694,14 @@
           <w:sz w:val="21"/>
           <w:lang w:val="es-AR"/>
         </w:rPr>
-        <w:t xml:space="preserve">). Resultado del 12 de octubre de 2026: </w:t>
-      </w:r>
-      <w:r>
-        <w:rPr>
-          <w:sz w:val="21"/>
-          <w:lang w:val="es-AR"/>
-        </w:rPr>
-        <w:t>39 de 39 casos aprobados</w:t>
-      </w:r>
-      <w:r>
-        <w:rPr>
-          <w:sz w:val="21"/>
-          <w:lang w:val="es-AR"/>
-        </w:rPr>
-        <w:t>.</w:t>
+        <w:t xml:space="preserve">). </w:t>
+      </w:r>
+      <w:r>
+        <w:rPr>
+          <w:sz w:val="21"/>
+          <w:lang w:val="es-AR"/>
+        </w:rPr>
+        <w:t>Resultado del 13 de octubre de 2026: 41 de 42. El caso que falló respondió bien, pero su consulta devolvió una fila por alarma en vez del conteo.</w:t>
       </w:r>
     </w:p>
     <w:p>
@@ -6829,7 +7002,7 @@
                 <w:sz w:val="19"/>
                 <w:lang w:val="es-AR"/>
               </w:rPr>
-              <w:t>de las corridas 4, 5 y 6</w:t>
+              <w:t>de las corridas 4 a 8</w:t>
             </w:r>
           </w:p>
         </w:tc>
@@ -7413,6 +7586,7 @@
           <w:sz w:val="21"/>
           <w:lang w:val="es-AR"/>
         </w:rPr>
+        <w:lastRenderedPageBreak/>
         <w:t>El despliegue en la nube del agente no se eligió como criterio.</w:t>
       </w:r>
     </w:p>
@@ -7428,7 +7602,6 @@
           <w:b/>
           <w:sz w:val="21"/>
         </w:rPr>
-        <w:lastRenderedPageBreak/>
         <w:t>Limitaciones</w:t>
       </w:r>
     </w:p>
@@ -7464,7 +7637,7 @@
           <w:sz w:val="21"/>
           <w:lang w:val="es-AR"/>
         </w:rPr>
-        <w:t>El 39 de 39 es el resultado de una corrida, no una garantía. Además, 39 casos</w:t>
+        <w:t>El 42 de 42 se repitió en dos corridas seguidas, pero el experimento de LangSmith del mismo día dio 41 de 42. Además, 42 casos</w:t>
       </w:r>
       <w:r>
         <w:rPr>
@@ -7514,7 +7687,14 @@
           <w:sz w:val="21"/>
           <w:lang w:val="es-AR"/>
         </w:rPr>
-        <w:t xml:space="preserve"> el límite es de 15 pedidos por minuto. Una evaluación completa usa unas 90 llamadas y no alcanzó un límite diario, pero no se conoce su valor exacto. Si se alcanza, el agente lo informa y la evaluación se detiene.</w:t>
+        <w:t xml:space="preserve"> el límite es de 15 pedidos por minuto. Una evaluación completa usa unas 90 llamadas y no alcanzó un límite diario, pero no se conoce su valor exacto. </w:t>
+      </w:r>
+      <w:r>
+        <w:rPr>
+          <w:sz w:val="21"/>
+          <w:lang w:val="es-AR"/>
+        </w:rPr>
+        <w:t>Si se alcanza, el agente lo informa y la evaluación se detiene. El tiempo depende del servicio: el percentil 90 fue de 4,8 s en una corrida y de 17,6 s en otra.</w:t>
       </w:r>
     </w:p>
     <w:p>

</xml_diff>

<commit_message>
Conteo en una sola fila y evaluacion final de 42 de 42 (T086, T088 a T090)
- Una pregunta que pide una cantidad devuelve el conteo en una sola fila, y los
  conteos no llevan unidad. Resuelve el caso both-02 del experimento de LangSmith.
- La evaluacion reconoce los cortes de conexion como errores ajenos al agente.
- Corrida final del 2026-10-14: 42 de 42 local y 42 de 42 en LangSmith.
- Se registra el limite diario de 500 pedidos de la capa gratuita.

Co-Authored-By: Claude Opus 5.5 <noreply@anthropic.com>
</commit_message>
<xml_diff>
--- a/docs/informe/informe.docx
+++ b/docs/informe/informe.docx
@@ -869,7 +869,7 @@
                 <w:sz w:val="19"/>
                 <w:lang w:val="es-AR"/>
               </w:rPr>
-              <w:t>85 tareas</w:t>
+              <w:t>90 tareas</w:t>
             </w:r>
             <w:r>
               <w:rPr>
@@ -1074,7 +1074,7 @@
           <w:sz w:val="21"/>
           <w:lang w:val="es-AR"/>
         </w:rPr>
-        <w:t>T045 a T085</w:t>
+        <w:t>T045 a T090</w:t>
       </w:r>
       <w:r>
         <w:rPr>
@@ -3395,22 +3395,21 @@
           <w:sz w:val="21"/>
           <w:lang w:val="es-AR"/>
         </w:rPr>
-        <w:t xml:space="preserve"> permite 5 pedidos por minuto y 20 por día, y </w:t>
-      </w:r>
-      <w:r>
-        <w:rPr>
-          <w:rStyle w:val="CodeChar"/>
-          <w:sz w:val="21"/>
-          <w:lang w:val="es-AR"/>
-        </w:rPr>
-        <w:t>gemini-3.5-flash-lite</w:t>
-      </w:r>
-      <w:r>
-        <w:rPr>
-          <w:sz w:val="21"/>
-          <w:lang w:val="es-AR"/>
-        </w:rPr>
-        <w:t xml:space="preserve"> 15 por minuto. Los embeddings funcionaron con una clave de la capa gratuita. </w:t>
+        <w:t xml:space="preserve"> permite 5 pedidos por minuto y 20 por día, </w:t>
+      </w:r>
+      <w:r>
+        <w:rPr>
+          <w:sz w:val="21"/>
+          <w:lang w:val="es-AR"/>
+        </w:rPr>
+        <w:t>y gemini-3.5-flash-lite 15 por minuto y 500 por día.</w:t>
+      </w:r>
+      <w:r>
+        <w:rPr>
+          <w:sz w:val="21"/>
+          <w:lang w:val="es-AR"/>
+        </w:rPr>
+        <w:t xml:space="preserve"> Los embeddings funcionaron con una clave de la capa gratuita. </w:t>
       </w:r>
       <w:r>
         <w:rPr>
@@ -3518,7 +3517,7 @@
           <w:sz w:val="21"/>
           <w:lang w:val="es-AR"/>
         </w:rPr>
-        <w:t>Son 100 y pasaron</w:t>
+        <w:t>Son 102 y pasaron</w:t>
       </w:r>
       <w:r>
         <w:rPr>
@@ -3546,7 +3545,7 @@
           <w:sz w:val="21"/>
           <w:lang w:val="es-AR"/>
         </w:rPr>
-        <w:t>el evaluador (16)</w:t>
+        <w:t>el evaluador (18)</w:t>
       </w:r>
       <w:r>
         <w:rPr>
@@ -3701,7 +3700,14 @@
           <w:sz w:val="21"/>
           <w:lang w:val="es-AR"/>
         </w:rPr>
-        <w:t>se corrió ocho veces entre el 10 y el 13 de octubre de 2026. La última dio 42 de 42 casos</w:t>
+        <w:t>se corrió doce veces entre el 10 y el 14 de octubre de 2026</w:t>
+      </w:r>
+      <w:r>
+        <w:rPr>
+          <w:sz w:val="21"/>
+          <w:lang w:val="es-AR"/>
+        </w:rPr>
+        <w:t>. La última dio 42 de 42 casos</w:t>
       </w:r>
       <w:r>
         <w:rPr>
@@ -4491,6 +4497,166 @@
           </w:p>
         </w:tc>
       </w:tr>
+      <w:tr>
+        <w:tc>
+          <w:tcPr>
+            <w:tcW w:w="2340" w:type="dxa"/>
+          </w:tcPr>
+          <w:p>
+            <w:pPr>
+              <w:spacing w:before="20" w:after="20" w:line="240" w:lineRule="auto"/>
+              <w:rPr>
+                <w:sz w:val="19"/>
+              </w:rPr>
+            </w:pPr>
+            <w:r>
+              <w:rPr>
+                <w:sz w:val="19"/>
+              </w:rPr>
+              <w:t>9 a 11</w:t>
+            </w:r>
+          </w:p>
+        </w:tc>
+        <w:tc>
+          <w:tcPr>
+            <w:tcW w:w="2340" w:type="dxa"/>
+          </w:tcPr>
+          <w:p>
+            <w:pPr>
+              <w:spacing w:before="20" w:after="20" w:line="240" w:lineRule="auto"/>
+              <w:rPr>
+                <w:sz w:val="19"/>
+              </w:rPr>
+            </w:pPr>
+            <w:r>
+              <w:rPr>
+                <w:sz w:val="19"/>
+              </w:rPr>
+              <w:t>gemini-3.5-flash-lite</w:t>
+            </w:r>
+          </w:p>
+        </w:tc>
+        <w:tc>
+          <w:tcPr>
+            <w:tcW w:w="2340" w:type="dxa"/>
+          </w:tcPr>
+          <w:p>
+            <w:pPr>
+              <w:spacing w:before="20" w:after="20" w:line="240" w:lineRule="auto"/>
+              <w:rPr>
+                <w:sz w:val="19"/>
+              </w:rPr>
+            </w:pPr>
+            <w:r>
+              <w:rPr>
+                <w:sz w:val="19"/>
+              </w:rPr>
+              <w:t>35, 41 y 41 de 42</w:t>
+            </w:r>
+          </w:p>
+        </w:tc>
+        <w:tc>
+          <w:tcPr>
+            <w:tcW w:w="2340" w:type="dxa"/>
+          </w:tcPr>
+          <w:p>
+            <w:pPr>
+              <w:spacing w:before="20" w:after="20" w:line="240" w:lineRule="auto"/>
+              <w:rPr>
+                <w:sz w:val="19"/>
+                <w:lang w:val="es-AR"/>
+              </w:rPr>
+            </w:pPr>
+            <w:r>
+              <w:rPr>
+                <w:sz w:val="19"/>
+                <w:lang w:val="es-AR"/>
+              </w:rPr>
+              <w:t>Afectadas por caídas del servicio (errores 503 y 504) y cortes de conexión, no por respuestas del agente</w:t>
+            </w:r>
+          </w:p>
+        </w:tc>
+      </w:tr>
+      <w:tr>
+        <w:tc>
+          <w:tcPr>
+            <w:tcW w:w="2340" w:type="dxa"/>
+          </w:tcPr>
+          <w:p>
+            <w:pPr>
+              <w:spacing w:before="20" w:after="20" w:line="240" w:lineRule="auto"/>
+              <w:rPr>
+                <w:sz w:val="19"/>
+              </w:rPr>
+            </w:pPr>
+            <w:r>
+              <w:rPr>
+                <w:sz w:val="19"/>
+              </w:rPr>
+              <w:t>12</w:t>
+            </w:r>
+          </w:p>
+        </w:tc>
+        <w:tc>
+          <w:tcPr>
+            <w:tcW w:w="2340" w:type="dxa"/>
+          </w:tcPr>
+          <w:p>
+            <w:pPr>
+              <w:spacing w:before="20" w:after="20" w:line="240" w:lineRule="auto"/>
+              <w:rPr>
+                <w:sz w:val="19"/>
+              </w:rPr>
+            </w:pPr>
+            <w:r>
+              <w:rPr>
+                <w:sz w:val="19"/>
+              </w:rPr>
+              <w:t>gemini-3.5-flash-lite</w:t>
+            </w:r>
+          </w:p>
+        </w:tc>
+        <w:tc>
+          <w:tcPr>
+            <w:tcW w:w="2340" w:type="dxa"/>
+          </w:tcPr>
+          <w:p>
+            <w:pPr>
+              <w:spacing w:before="20" w:after="20" w:line="240" w:lineRule="auto"/>
+              <w:rPr>
+                <w:sz w:val="19"/>
+              </w:rPr>
+            </w:pPr>
+            <w:r>
+              <w:rPr>
+                <w:sz w:val="19"/>
+              </w:rPr>
+              <w:t>42 de 42</w:t>
+            </w:r>
+          </w:p>
+        </w:tc>
+        <w:tc>
+          <w:tcPr>
+            <w:tcW w:w="2340" w:type="dxa"/>
+          </w:tcPr>
+          <w:p>
+            <w:pPr>
+              <w:spacing w:before="20" w:after="20" w:line="240" w:lineRule="auto"/>
+              <w:rPr>
+                <w:sz w:val="19"/>
+                <w:lang w:val="es-AR"/>
+              </w:rPr>
+            </w:pPr>
+            <w:r>
+              <w:rPr>
+                <w:sz w:val="19"/>
+                <w:lang w:val="es-AR"/>
+              </w:rPr>
+              <w:t>Versión final: conteo en una sola fila y sin unidad en los conteos</w:t>
+            </w:r>
+          </w:p>
+        </w:tc>
+      </w:tr>
     </w:tbl>
     <w:p>
       <w:pPr>
@@ -4506,7 +4672,7 @@
           <w:sz w:val="21"/>
           <w:lang w:val="es-AR"/>
         </w:rPr>
-        <w:t>Criterios de éxito en la corrida 8</w:t>
+        <w:t>Criterios de éxito en la corrida 12</w:t>
       </w:r>
       <w:r>
         <w:rPr>
@@ -4529,7 +4695,7 @@
           <w:sz w:val="21"/>
           <w:lang w:val="es-AR"/>
         </w:rPr>
-        <w:t>20261013-205335.json</w:t>
+        <w:t>20261014-224501.json</w:t>
       </w:r>
       <w:r>
         <w:rPr>
@@ -4975,7 +5141,7 @@
               <w:rPr>
                 <w:sz w:val="19"/>
               </w:rPr>
-              <w:t>4,8 s (mediana 3,3 s)</w:t>
+              <w:t>6,2 s (mediana 3,3 s)</w:t>
             </w:r>
           </w:p>
         </w:tc>
@@ -5388,6 +5554,7 @@
                 <w:sz w:val="19"/>
                 <w:lang w:val="es-AR"/>
               </w:rPr>
+              <w:lastRenderedPageBreak/>
               <w:t>Una respuesta correcta se contó como error</w:t>
             </w:r>
           </w:p>
@@ -5448,7 +5615,6 @@
         <w:rPr>
           <w:lang w:val="es-AR"/>
         </w:rPr>
-        <w:lastRenderedPageBreak/>
         <w:t>Ejemplos de consultas y evidencias</w:t>
       </w:r>
     </w:p>
@@ -6701,7 +6867,7 @@
           <w:sz w:val="21"/>
           <w:lang w:val="es-AR"/>
         </w:rPr>
-        <w:t>Resultado del 13 de octubre de 2026: 41 de 42. El caso que falló respondió bien, pero su consulta devolvió una fila por alarma en vez del conteo.</w:t>
+        <w:t>El 13 de octubre dio 41 de 42: un caso respondió bien, pero su consulta devolvió una fila por alarma en vez del conteo. Se corrigió y el 14 de octubre dio 42 de 42.</w:t>
       </w:r>
     </w:p>
     <w:p>
@@ -7002,7 +7168,7 @@
                 <w:sz w:val="19"/>
                 <w:lang w:val="es-AR"/>
               </w:rPr>
-              <w:t>de las corridas 4 a 8</w:t>
+              <w:t>de la corrida final (12)</w:t>
             </w:r>
           </w:p>
         </w:tc>
@@ -7637,7 +7803,14 @@
           <w:sz w:val="21"/>
           <w:lang w:val="es-AR"/>
         </w:rPr>
-        <w:t>El 42 de 42 se repitió en dos corridas seguidas, pero el experimento de LangSmith del mismo día dio 41 de 42. Además, 42 casos</w:t>
+        <w:t>El 42 de 42 de la corrida final es una medición, no una garantía: el 13 de octubre el experimento de LangSmith dio 41 de 42 por una consulta distinta del modelo.</w:t>
+      </w:r>
+      <w:r>
+        <w:rPr>
+          <w:sz w:val="21"/>
+          <w:lang w:val="es-AR"/>
+        </w:rPr>
+        <w:t xml:space="preserve"> Además, 42 casos</w:t>
       </w:r>
       <w:r>
         <w:rPr>
@@ -7687,7 +7860,21 @@
           <w:sz w:val="21"/>
           <w:lang w:val="es-AR"/>
         </w:rPr>
-        <w:t xml:space="preserve"> el límite es de 15 pedidos por minuto. Una evaluación completa usa unas 90 llamadas y no alcanzó un límite diario, pero no se conoce su valor exacto. </w:t>
+        <w:t xml:space="preserve"> el límite es de 15 pedidos por minuto. </w:t>
+      </w:r>
+      <w:r>
+        <w:rPr>
+          <w:sz w:val="21"/>
+          <w:lang w:val="es-AR"/>
+        </w:rPr>
+        <w:t>Una evaluación completa usa unas 110 llamadas y el límite diario es de 500: se alcanzó el 13 de octubre, tras varias corridas, y el agente no respondió hasta el día siguiente.</w:t>
+      </w:r>
+      <w:r>
+        <w:rPr>
+          <w:sz w:val="21"/>
+          <w:lang w:val="es-AR"/>
+        </w:rPr>
+        <w:t xml:space="preserve"> </w:t>
       </w:r>
       <w:r>
         <w:rPr>

</xml_diff>

<commit_message>
Conjunto reservado y ejemplos de los prompts que no repiten casos (T091 a T096)
Decisiones del autor registradas en spec.md (FR-020 y FR-021) y tareas derivadas
con speckit-converge.
- Los ejemplos de los prompts repetian siete casos de la evaluacion; se
  reemplazaron y esos siete casos siguen aprobando.
- Conjunto reservado de 8 casos en eval/reservado.jsonl, corrido una sola vez:
  8 de 8. El evaluador acepta --cases y guarda ese resultado aparte.
- Queda abierta T097: correr el conjunto principal completo el 2026-10-15.

Co-Authored-By: Claude Opus 5.5 <noreply@anthropic.com>
</commit_message>
<xml_diff>
--- a/docs/informe/informe.docx
+++ b/docs/informe/informe.docx
@@ -686,7 +686,7 @@
                 <w:sz w:val="19"/>
                 <w:lang w:val="es-AR"/>
               </w:rPr>
-              <w:t>19 requisitos</w:t>
+              <w:t>21 requisitos</w:t>
             </w:r>
             <w:r>
               <w:rPr>
@@ -869,7 +869,7 @@
                 <w:sz w:val="19"/>
                 <w:lang w:val="es-AR"/>
               </w:rPr>
-              <w:t>90 tareas</w:t>
+              <w:t>97 tareas</w:t>
             </w:r>
             <w:r>
               <w:rPr>
@@ -1074,7 +1074,7 @@
           <w:sz w:val="21"/>
           <w:lang w:val="es-AR"/>
         </w:rPr>
-        <w:t>T045 a T090</w:t>
+        <w:t>T045 a T097</w:t>
       </w:r>
       <w:r>
         <w:rPr>
@@ -3517,7 +3517,7 @@
           <w:sz w:val="21"/>
           <w:lang w:val="es-AR"/>
         </w:rPr>
-        <w:t>Son 102 y pasaron</w:t>
+        <w:t>Son 103 y pasaron</w:t>
       </w:r>
       <w:r>
         <w:rPr>
@@ -3545,7 +3545,7 @@
           <w:sz w:val="21"/>
           <w:lang w:val="es-AR"/>
         </w:rPr>
-        <w:t>el evaluador (18)</w:t>
+        <w:t>el evaluador (19)</w:t>
       </w:r>
       <w:r>
         <w:rPr>
@@ -3729,7 +3729,14 @@
           <w:sz w:val="21"/>
           <w:lang w:val="es-AR"/>
         </w:rPr>
-        <w:t>. Las tres primeras sirvieron para encontrar y corregir errores.</w:t>
+        <w:t xml:space="preserve">. </w:t>
+      </w:r>
+      <w:r>
+        <w:rPr>
+          <w:sz w:val="21"/>
+          <w:lang w:val="es-AR"/>
+        </w:rPr>
+        <w:t>Las tres primeras sirvieron para encontrar y corregir errores. Además, un conjunto reservado de 8 casos nuevos, que no se usó para ajustar los prompts, se corrió una sola vez el 14 de octubre y dio 8 de 8.</w:t>
       </w:r>
     </w:p>
     <w:tbl>
@@ -3906,7 +3913,15 @@
                 <w:sz w:val="19"/>
                 <w:lang w:val="es-AR"/>
               </w:rPr>
-              <w:t>31 casos cortados por la cuota gratuita: 20 pedidos por día</w:t>
+              <w:t xml:space="preserve">31 casos cortados por la cuota gratuita: 20 pedidos </w:t>
+            </w:r>
+            <w:r>
+              <w:rPr>
+                <w:sz w:val="19"/>
+                <w:lang w:val="es-AR"/>
+              </w:rPr>
+              <w:lastRenderedPageBreak/>
+              <w:t>por día</w:t>
             </w:r>
           </w:p>
         </w:tc>
@@ -3927,6 +3942,7 @@
               <w:rPr>
                 <w:sz w:val="19"/>
               </w:rPr>
+              <w:lastRenderedPageBreak/>
               <w:t>2</w:t>
             </w:r>
           </w:p>
@@ -3947,15 +3963,7 @@
                 <w:rStyle w:val="CodeChar"/>
                 <w:sz w:val="19"/>
               </w:rPr>
-              <w:t>gemini-3.5-flash-</w:t>
-            </w:r>
-            <w:r>
-              <w:rPr>
-                <w:rStyle w:val="CodeChar"/>
-                <w:sz w:val="19"/>
-              </w:rPr>
-              <w:lastRenderedPageBreak/>
-              <w:t>lite</w:t>
+              <w:t>gemini-3.5-flash-lite</w:t>
             </w:r>
           </w:p>
         </w:tc>
@@ -3974,7 +3982,6 @@
               <w:rPr>
                 <w:sz w:val="19"/>
               </w:rPr>
-              <w:lastRenderedPageBreak/>
               <w:t>22 de 35</w:t>
             </w:r>
           </w:p>
@@ -3996,15 +4003,7 @@
                 <w:sz w:val="19"/>
                 <w:lang w:val="es-AR"/>
               </w:rPr>
-              <w:t xml:space="preserve">La ingesta había guardado </w:t>
-            </w:r>
-            <w:r>
-              <w:rPr>
-                <w:sz w:val="19"/>
-                <w:lang w:val="es-AR"/>
-              </w:rPr>
-              <w:lastRenderedPageBreak/>
-              <w:t>2 fragmentos en vez de 18</w:t>
+              <w:t>La ingesta había guardado 2 fragmentos en vez de 18</w:t>
             </w:r>
           </w:p>
         </w:tc>
@@ -4025,7 +4024,6 @@
               <w:rPr>
                 <w:sz w:val="19"/>
               </w:rPr>
-              <w:lastRenderedPageBreak/>
               <w:t>3</w:t>
             </w:r>
           </w:p>
@@ -5489,6 +5487,7 @@
                 <w:sz w:val="19"/>
                 <w:lang w:val="es-AR"/>
               </w:rPr>
+              <w:lastRenderedPageBreak/>
               <w:t>Una pregunta sin respaldo se respondió sin buscar</w:t>
             </w:r>
           </w:p>
@@ -5554,7 +5553,6 @@
                 <w:sz w:val="19"/>
                 <w:lang w:val="es-AR"/>
               </w:rPr>
-              <w:lastRenderedPageBreak/>
               <w:t>Una respuesta correcta se contó como error</w:t>
             </w:r>
           </w:p>

</xml_diff>

<commit_message>
Evaluacion de 43 casos con los prompts nuevos y los empates (T097, T101)
Corrida del 2026-10-15: 43 de 43. Experimento de LangSmith: 42 de 43, con la
causa registrada en tasks.md. Informe, README y guia actualizados.

Co-Authored-By: Claude Opus 5.5 <noreply@anthropic.com>
</commit_message>
<xml_diff>
--- a/docs/informe/informe.docx
+++ b/docs/informe/informe.docx
@@ -686,7 +686,7 @@
                 <w:sz w:val="19"/>
                 <w:lang w:val="es-AR"/>
               </w:rPr>
-              <w:t>21 requisitos</w:t>
+              <w:t>22 requisitos</w:t>
             </w:r>
             <w:r>
               <w:rPr>
@@ -869,7 +869,7 @@
                 <w:sz w:val="19"/>
                 <w:lang w:val="es-AR"/>
               </w:rPr>
-              <w:t>97 tareas</w:t>
+              <w:t>101 tareas</w:t>
             </w:r>
             <w:r>
               <w:rPr>
@@ -1074,7 +1074,7 @@
           <w:sz w:val="21"/>
           <w:lang w:val="es-AR"/>
         </w:rPr>
-        <w:t>T045 a T097</w:t>
+        <w:t>T045 a T101</w:t>
       </w:r>
       <w:r>
         <w:rPr>
@@ -3462,7 +3462,7 @@
           <w:sz w:val="21"/>
           <w:lang w:val="es-AR"/>
         </w:rPr>
-        <w:t>La evaluación de 42 casos sí usa</w:t>
+        <w:t>La evaluación de 43 casos sí usa</w:t>
       </w:r>
       <w:r>
         <w:rPr>
@@ -3517,14 +3517,28 @@
           <w:sz w:val="21"/>
           <w:lang w:val="es-AR"/>
         </w:rPr>
-        <w:t>Son 103 y pasaron</w:t>
-      </w:r>
-      <w:r>
-        <w:rPr>
-          <w:sz w:val="21"/>
-          <w:lang w:val="es-AR"/>
-        </w:rPr>
-        <w:t xml:space="preserve"> todas en la última corrida. Usan un modelo falso con respuestas guionadas, así que prueban la lógica del sistema y no la calidad de Gemini. Cubren el validador de SQL (30 pruebas), el rol de solo lectura contra una base real (10), la integridad de los datos (10), las rutas del grafo y los </w:t>
+        <w:t>Son 104 y pasaron</w:t>
+      </w:r>
+      <w:r>
+        <w:rPr>
+          <w:sz w:val="21"/>
+          <w:lang w:val="es-AR"/>
+        </w:rPr>
+        <w:t xml:space="preserve"> todas en la última corrida. Usan un modelo falso con respuestas guionadas, así que prueban la lógica del sistema y no la calidad de Gemini. Cubren el </w:t>
+      </w:r>
+      <w:r>
+        <w:rPr>
+          <w:sz w:val="21"/>
+          <w:lang w:val="es-AR"/>
+        </w:rPr>
+        <w:t>validador de SQL (31 pruebas)</w:t>
+      </w:r>
+      <w:r>
+        <w:rPr>
+          <w:sz w:val="21"/>
+          <w:lang w:val="es-AR"/>
+        </w:rPr>
+        <w:t xml:space="preserve">, el rol de solo lectura contra una base real (10), la integridad de los datos (10), las rutas del grafo y los </w:t>
       </w:r>
       <w:r>
         <w:rPr>
@@ -3585,7 +3599,7 @@
           <w:sz w:val="21"/>
           <w:lang w:val="es-AR"/>
         </w:rPr>
-        <w:t>Evaluación de 42 casos (</w:t>
+        <w:t>Evaluación de 43 casos (</w:t>
       </w:r>
       <w:r>
         <w:rPr>
@@ -3631,7 +3645,7 @@
           <w:sz w:val="21"/>
           <w:lang w:val="es-AR"/>
         </w:rPr>
-        <w:t>7 casos borde (equipo inexistente, pregunta ambigua o ajena a la planta, resultado recortado, período sin datos, unidad de medida y evolución por día)</w:t>
+        <w:t>8 casos borde (equipo inexistente, pregunta ambigua o ajena a la planta, resultado recortado, período sin datos, unidad de medida, evolución por día y empate en el primer lugar)</w:t>
       </w:r>
       <w:r>
         <w:rPr>
@@ -3700,14 +3714,7 @@
           <w:sz w:val="21"/>
           <w:lang w:val="es-AR"/>
         </w:rPr>
-        <w:t>se corrió doce veces entre el 10 y el 14 de octubre de 2026</w:t>
-      </w:r>
-      <w:r>
-        <w:rPr>
-          <w:sz w:val="21"/>
-          <w:lang w:val="es-AR"/>
-        </w:rPr>
-        <w:t>. La última dio 42 de 42 casos</w:t>
+        <w:t>se corrió trece veces entre el 10 y el 15 de octubre de 2026. La última dio 43 de 43 casos</w:t>
       </w:r>
       <w:r>
         <w:rPr>
@@ -4655,6 +4662,86 @@
           </w:p>
         </w:tc>
       </w:tr>
+      <w:tr>
+        <w:tc>
+          <w:tcPr>
+            <w:tcW w:w="2340" w:type="dxa"/>
+          </w:tcPr>
+          <w:p>
+            <w:pPr>
+              <w:spacing w:before="20" w:after="20" w:line="240" w:lineRule="auto"/>
+              <w:rPr>
+                <w:sz w:val="19"/>
+              </w:rPr>
+            </w:pPr>
+            <w:r>
+              <w:rPr>
+                <w:sz w:val="19"/>
+              </w:rPr>
+              <w:t>13</w:t>
+            </w:r>
+          </w:p>
+        </w:tc>
+        <w:tc>
+          <w:tcPr>
+            <w:tcW w:w="2340" w:type="dxa"/>
+          </w:tcPr>
+          <w:p>
+            <w:pPr>
+              <w:spacing w:before="20" w:after="20" w:line="240" w:lineRule="auto"/>
+              <w:rPr>
+                <w:sz w:val="19"/>
+              </w:rPr>
+            </w:pPr>
+            <w:r>
+              <w:rPr>
+                <w:sz w:val="19"/>
+              </w:rPr>
+              <w:t>gemini-3.5-flash-lite</w:t>
+            </w:r>
+          </w:p>
+        </w:tc>
+        <w:tc>
+          <w:tcPr>
+            <w:tcW w:w="2340" w:type="dxa"/>
+          </w:tcPr>
+          <w:p>
+            <w:pPr>
+              <w:spacing w:before="20" w:after="20" w:line="240" w:lineRule="auto"/>
+              <w:rPr>
+                <w:sz w:val="19"/>
+              </w:rPr>
+            </w:pPr>
+            <w:r>
+              <w:rPr>
+                <w:sz w:val="19"/>
+              </w:rPr>
+              <w:t>43 de 43</w:t>
+            </w:r>
+          </w:p>
+        </w:tc>
+        <w:tc>
+          <w:tcPr>
+            <w:tcW w:w="2340" w:type="dxa"/>
+          </w:tcPr>
+          <w:p>
+            <w:pPr>
+              <w:spacing w:before="20" w:after="20" w:line="240" w:lineRule="auto"/>
+              <w:rPr>
+                <w:sz w:val="19"/>
+                <w:lang w:val="es-AR"/>
+              </w:rPr>
+            </w:pPr>
+            <w:r>
+              <w:rPr>
+                <w:sz w:val="19"/>
+                <w:lang w:val="es-AR"/>
+              </w:rPr>
+              <w:t>Ejemplos de los prompts sin repetir casos, y empates. Mediana de tiempo de 10,4 s</w:t>
+            </w:r>
+          </w:p>
+        </w:tc>
+      </w:tr>
     </w:tbl>
     <w:p>
       <w:pPr>
@@ -4670,7 +4757,7 @@
           <w:sz w:val="21"/>
           <w:lang w:val="es-AR"/>
         </w:rPr>
-        <w:t>Criterios de éxito en la corrida 12</w:t>
+        <w:t>Criterios de éxito en la corrida 13</w:t>
       </w:r>
       <w:r>
         <w:rPr>
@@ -4693,7 +4780,7 @@
           <w:sz w:val="21"/>
           <w:lang w:val="es-AR"/>
         </w:rPr>
-        <w:t>20261014-224501.json</w:t>
+        <w:t>20261015-001031.json</w:t>
       </w:r>
       <w:r>
         <w:rPr>
@@ -4834,7 +4921,7 @@
               <w:rPr>
                 <w:sz w:val="19"/>
               </w:rPr>
-              <w:t>100% (42 de 42)</w:t>
+              <w:t>100% (43 de 43)</w:t>
             </w:r>
           </w:p>
         </w:tc>
@@ -5139,7 +5226,7 @@
               <w:rPr>
                 <w:sz w:val="19"/>
               </w:rPr>
-              <w:t>6,2 s (mediana 3,3 s)</w:t>
+              <w:t>15,9 s (mediana 10,4 s)</w:t>
             </w:r>
           </w:p>
         </w:tc>
@@ -5357,49 +5444,75 @@
                 <w:sz w:val="19"/>
                 <w:lang w:val="es-AR"/>
               </w:rPr>
-              <w:t>El agente inventó una presión nominal</w:t>
-            </w:r>
-          </w:p>
-        </w:tc>
-        <w:tc>
-          <w:tcPr>
-            <w:tcW w:w="3120" w:type="dxa"/>
-          </w:tcPr>
-          <w:p>
-            <w:pPr>
-              <w:spacing w:before="20" w:after="20" w:line="240" w:lineRule="auto"/>
-              <w:rPr>
-                <w:sz w:val="19"/>
-                <w:lang w:val="es-AR"/>
-              </w:rPr>
-            </w:pPr>
-            <w:r>
-              <w:rPr>
-                <w:sz w:val="19"/>
-                <w:lang w:val="es-AR"/>
-              </w:rPr>
-              <w:t>El SQL devolvió el umbral crítico con el nombre del dato pedido</w:t>
-            </w:r>
-          </w:p>
-        </w:tc>
-        <w:tc>
-          <w:tcPr>
-            <w:tcW w:w="3120" w:type="dxa"/>
-          </w:tcPr>
-          <w:p>
-            <w:pPr>
-              <w:spacing w:before="20" w:after="20" w:line="240" w:lineRule="auto"/>
-              <w:rPr>
-                <w:sz w:val="19"/>
-                <w:lang w:val="es-AR"/>
-              </w:rPr>
-            </w:pPr>
-            <w:r>
-              <w:rPr>
-                <w:sz w:val="19"/>
-                <w:lang w:val="es-AR"/>
-              </w:rPr>
-              <w:t>Reglas nuevas en los prompts de SQL y de síntesis (T052)</w:t>
+              <w:t xml:space="preserve">El agente inventó una presión </w:t>
+            </w:r>
+            <w:r>
+              <w:rPr>
+                <w:sz w:val="19"/>
+                <w:lang w:val="es-AR"/>
+              </w:rPr>
+              <w:lastRenderedPageBreak/>
+              <w:t>nominal</w:t>
+            </w:r>
+          </w:p>
+        </w:tc>
+        <w:tc>
+          <w:tcPr>
+            <w:tcW w:w="3120" w:type="dxa"/>
+          </w:tcPr>
+          <w:p>
+            <w:pPr>
+              <w:spacing w:before="20" w:after="20" w:line="240" w:lineRule="auto"/>
+              <w:rPr>
+                <w:sz w:val="19"/>
+                <w:lang w:val="es-AR"/>
+              </w:rPr>
+            </w:pPr>
+            <w:r>
+              <w:rPr>
+                <w:sz w:val="19"/>
+                <w:lang w:val="es-AR"/>
+              </w:rPr>
+              <w:lastRenderedPageBreak/>
+              <w:t xml:space="preserve">El SQL devolvió el umbral crítico </w:t>
+            </w:r>
+            <w:r>
+              <w:rPr>
+                <w:sz w:val="19"/>
+                <w:lang w:val="es-AR"/>
+              </w:rPr>
+              <w:lastRenderedPageBreak/>
+              <w:t>con el nombre del dato pedido</w:t>
+            </w:r>
+          </w:p>
+        </w:tc>
+        <w:tc>
+          <w:tcPr>
+            <w:tcW w:w="3120" w:type="dxa"/>
+          </w:tcPr>
+          <w:p>
+            <w:pPr>
+              <w:spacing w:before="20" w:after="20" w:line="240" w:lineRule="auto"/>
+              <w:rPr>
+                <w:sz w:val="19"/>
+                <w:lang w:val="es-AR"/>
+              </w:rPr>
+            </w:pPr>
+            <w:r>
+              <w:rPr>
+                <w:sz w:val="19"/>
+                <w:lang w:val="es-AR"/>
+              </w:rPr>
+              <w:lastRenderedPageBreak/>
+              <w:t xml:space="preserve">Reglas nuevas en los prompts de SQL </w:t>
+            </w:r>
+            <w:r>
+              <w:rPr>
+                <w:sz w:val="19"/>
+                <w:lang w:val="es-AR"/>
+              </w:rPr>
+              <w:lastRenderedPageBreak/>
+              <w:t>y de síntesis (T052)</w:t>
             </w:r>
           </w:p>
         </w:tc>
@@ -5422,6 +5535,7 @@
                 <w:sz w:val="19"/>
                 <w:lang w:val="es-AR"/>
               </w:rPr>
+              <w:lastRenderedPageBreak/>
               <w:t>Respondió "no tengo esa información" con filas correctas</w:t>
             </w:r>
           </w:p>
@@ -5487,7 +5601,6 @@
                 <w:sz w:val="19"/>
                 <w:lang w:val="es-AR"/>
               </w:rPr>
-              <w:lastRenderedPageBreak/>
               <w:t>Una pregunta sin respaldo se respondió sin buscar</w:t>
             </w:r>
           </w:p>
@@ -6345,7 +6458,15 @@
                 <w:sz w:val="19"/>
                 <w:lang w:val="es-AR"/>
               </w:rPr>
-              <w:t>¿Cuánto cuesta un rodamiento de repuesto?</w:t>
+              <w:t xml:space="preserve">¿Cuánto cuesta un </w:t>
+            </w:r>
+            <w:r>
+              <w:rPr>
+                <w:sz w:val="19"/>
+                <w:lang w:val="es-AR"/>
+              </w:rPr>
+              <w:lastRenderedPageBreak/>
+              <w:t>rodamiento de repuesto?</w:t>
             </w:r>
           </w:p>
         </w:tc>
@@ -6364,6 +6485,7 @@
               <w:rPr>
                 <w:sz w:val="19"/>
               </w:rPr>
+              <w:lastRenderedPageBreak/>
               <w:t>Ninguna (no hay dato)</w:t>
             </w:r>
           </w:p>
@@ -6385,7 +6507,15 @@
                 <w:sz w:val="19"/>
                 <w:lang w:val="es-AR"/>
               </w:rPr>
-              <w:t>Dice que no tiene la información</w:t>
+              <w:t xml:space="preserve">Dice que no tiene la </w:t>
+            </w:r>
+            <w:r>
+              <w:rPr>
+                <w:sz w:val="19"/>
+                <w:lang w:val="es-AR"/>
+              </w:rPr>
+              <w:lastRenderedPageBreak/>
+              <w:t>información</w:t>
             </w:r>
           </w:p>
         </w:tc>
@@ -6404,6 +6534,7 @@
               <w:rPr>
                 <w:sz w:val="19"/>
               </w:rPr>
+              <w:lastRenderedPageBreak/>
               <w:t>No tengo esa información.</w:t>
             </w:r>
           </w:p>
@@ -6478,7 +6609,6 @@
           <w:noProof/>
           <w:sz w:val="21"/>
         </w:rPr>
-        <w:lastRenderedPageBreak/>
         <w:drawing>
           <wp:inline distT="0" distB="0" distL="0" distR="0" wp14:anchorId="383ABE1E" wp14:editId="628F97A9">
             <wp:extent cx="4445000" cy="2778125"/>
@@ -6821,7 +6951,7 @@
           <w:sz w:val="21"/>
           <w:lang w:val="es-AR"/>
         </w:rPr>
-        <w:t>Los 42 casos se subieron</w:t>
+        <w:t>Los 43 casos se subieron</w:t>
       </w:r>
       <w:r>
         <w:rPr>
@@ -6865,7 +6995,14 @@
           <w:sz w:val="21"/>
           <w:lang w:val="es-AR"/>
         </w:rPr>
-        <w:t>El 13 de octubre dio 41 de 42: un caso respondió bien, pero su consulta devolvió una fila por alarma en vez del conteo. Se corrigió y el 14 de octubre dio 42 de 42.</w:t>
+        <w:t xml:space="preserve">El 13 de octubre dio 41 de 42: un caso respondió bien, pero su consulta devolvió una fila por alarma en vez del conteo. </w:t>
+      </w:r>
+      <w:r>
+        <w:rPr>
+          <w:sz w:val="21"/>
+          <w:lang w:val="es-AR"/>
+        </w:rPr>
+        <w:t>Se corrigió y el 14 de octubre dio 42 de 42. El 15 de octubre, con 43 casos, dio 42 de 43: una pregunta sin respaldo se respondió bien, pero sin buscar en las fuentes.</w:t>
       </w:r>
     </w:p>
     <w:p>
@@ -7166,7 +7303,7 @@
                 <w:sz w:val="19"/>
                 <w:lang w:val="es-AR"/>
               </w:rPr>
-              <w:t>de la corrida final (12)</w:t>
+              <w:t>de la corrida final (13)</w:t>
             </w:r>
           </w:p>
         </w:tc>
@@ -7710,27 +7847,36 @@
                 <w:sz w:val="19"/>
                 <w:lang w:val="es-AR"/>
               </w:rPr>
-              <w:t>Cumplido. Trazas, conjunto de datos y experimento de evaluación en el servicio real</w:t>
-            </w:r>
-          </w:p>
-        </w:tc>
-        <w:tc>
-          <w:tcPr>
-            <w:tcW w:w="3120" w:type="dxa"/>
-          </w:tcPr>
-          <w:p>
-            <w:pPr>
-              <w:spacing w:before="20" w:after="20" w:line="240" w:lineRule="auto"/>
-              <w:rPr>
-                <w:sz w:val="19"/>
-                <w:lang w:val="es-AR"/>
-              </w:rPr>
-            </w:pPr>
-            <w:r>
-              <w:rPr>
-                <w:sz w:val="19"/>
-                <w:lang w:val="es-AR"/>
-              </w:rPr>
+              <w:t xml:space="preserve">Cumplido. Trazas, conjunto de datos y experimento de evaluación en el </w:t>
+            </w:r>
+            <w:r>
+              <w:rPr>
+                <w:sz w:val="19"/>
+                <w:lang w:val="es-AR"/>
+              </w:rPr>
+              <w:lastRenderedPageBreak/>
+              <w:t>servicio real</w:t>
+            </w:r>
+          </w:p>
+        </w:tc>
+        <w:tc>
+          <w:tcPr>
+            <w:tcW w:w="3120" w:type="dxa"/>
+          </w:tcPr>
+          <w:p>
+            <w:pPr>
+              <w:spacing w:before="20" w:after="20" w:line="240" w:lineRule="auto"/>
+              <w:rPr>
+                <w:sz w:val="19"/>
+                <w:lang w:val="es-AR"/>
+              </w:rPr>
+            </w:pPr>
+            <w:r>
+              <w:rPr>
+                <w:sz w:val="19"/>
+                <w:lang w:val="es-AR"/>
+              </w:rPr>
+              <w:lastRenderedPageBreak/>
               <w:t>Captura de una traza con sus pasos y tiempos en la sección de evidencias</w:t>
             </w:r>
           </w:p>
@@ -7750,7 +7896,6 @@
           <w:sz w:val="21"/>
           <w:lang w:val="es-AR"/>
         </w:rPr>
-        <w:lastRenderedPageBreak/>
         <w:t>El despliegue en la nube del agente no se eligió como criterio.</w:t>
       </w:r>
     </w:p>
@@ -7801,14 +7946,7 @@
           <w:sz w:val="21"/>
           <w:lang w:val="es-AR"/>
         </w:rPr>
-        <w:t>El 42 de 42 de la corrida final es una medición, no una garantía: el 13 de octubre el experimento de LangSmith dio 41 de 42 por una consulta distinta del modelo.</w:t>
-      </w:r>
-      <w:r>
-        <w:rPr>
-          <w:sz w:val="21"/>
-          <w:lang w:val="es-AR"/>
-        </w:rPr>
-        <w:t xml:space="preserve"> Además, 42 casos</w:t>
+        <w:t>El 43 de 43 de la corrida final es una medición, no una garantía: el experimento de LangSmith del mismo día dio 42 de 43, porque el modelo no responde siempre igual. Además, 43 casos</w:t>
       </w:r>
       <w:r>
         <w:rPr>

</xml_diff>

<commit_message>
Informe: criterio de despliegue y tabla de corridas reducida a 5 filas (T024, Word)
Co-Authored-By: Claude Opus 5.5 <noreply@anthropic.com>
</commit_message>
<xml_diff>
--- a/docs/informe/informe.docx
+++ b/docs/informe/informe.docx
@@ -3517,7 +3517,7 @@
           <w:sz w:val="21"/>
           <w:lang w:val="es-AR"/>
         </w:rPr>
-        <w:t>Son 104 y pasaron</w:t>
+        <w:t>Son 105 y pasaron</w:t>
       </w:r>
       <w:r>
         <w:rPr>
@@ -3566,7 +3566,7 @@
           <w:sz w:val="21"/>
           <w:lang w:val="es-AR"/>
         </w:rPr>
-        <w:t>, la fragmentación y los embeddings (6) y la interfaz (4).</w:t>
+        <w:t>, la fragmentación y los embeddings (6) y la interfaz (5).</w:t>
       </w:r>
     </w:p>
     <w:p>
@@ -3714,7 +3714,7 @@
           <w:sz w:val="21"/>
           <w:lang w:val="es-AR"/>
         </w:rPr>
-        <w:t>se corrió trece veces entre el 10 y el 15 de octubre de 2026. La última dio 43 de 43 casos</w:t>
+        <w:t>se corrió trece veces entre el 10 y el 15 de octubre de 2026; la tabla muestra 5 de esas corridas y las 13 están en eval/results/. La última dio 43 de 43 casos</w:t>
       </w:r>
       <w:r>
         <w:rPr>
@@ -4112,7 +4112,7 @@
               <w:rPr>
                 <w:sz w:val="19"/>
               </w:rPr>
-              <w:t>4</w:t>
+              <w:t>9 a 11</w:t>
             </w:r>
           </w:p>
         </w:tc>
@@ -4129,7 +4129,6 @@
             </w:pPr>
             <w:r>
               <w:rPr>
-                <w:rStyle w:val="CodeChar"/>
                 <w:sz w:val="19"/>
               </w:rPr>
               <w:t>gemini-3.5-flash-lite</w:t>
@@ -4151,7 +4150,7 @@
               <w:rPr>
                 <w:sz w:val="19"/>
               </w:rPr>
-              <w:t>35 de 35</w:t>
+              <w:t>35, 41 y 41 de 42</w:t>
             </w:r>
           </w:p>
         </w:tc>
@@ -4172,492 +4171,7 @@
                 <w:sz w:val="19"/>
                 <w:lang w:val="es-AR"/>
               </w:rPr>
-              <w:t>Los seis criterios medibles de la especificación cumplen</w:t>
-            </w:r>
-          </w:p>
-        </w:tc>
-      </w:tr>
-      <w:tr>
-        <w:tc>
-          <w:tcPr>
-            <w:tcW w:w="2340" w:type="dxa"/>
-          </w:tcPr>
-          <w:p>
-            <w:pPr>
-              <w:spacing w:before="20" w:after="20" w:line="240" w:lineRule="auto"/>
-              <w:rPr>
-                <w:sz w:val="19"/>
-              </w:rPr>
-            </w:pPr>
-            <w:r>
-              <w:rPr>
-                <w:sz w:val="19"/>
-              </w:rPr>
-              <w:t>5</w:t>
-            </w:r>
-          </w:p>
-        </w:tc>
-        <w:tc>
-          <w:tcPr>
-            <w:tcW w:w="2340" w:type="dxa"/>
-          </w:tcPr>
-          <w:p>
-            <w:pPr>
-              <w:spacing w:before="20" w:after="20" w:line="240" w:lineRule="auto"/>
-              <w:rPr>
-                <w:sz w:val="19"/>
-              </w:rPr>
-            </w:pPr>
-            <w:r>
-              <w:rPr>
-                <w:sz w:val="19"/>
-              </w:rPr>
-              <w:t>gemini-3.5-flash-lite</w:t>
-            </w:r>
-          </w:p>
-        </w:tc>
-        <w:tc>
-          <w:tcPr>
-            <w:tcW w:w="2340" w:type="dxa"/>
-          </w:tcPr>
-          <w:p>
-            <w:pPr>
-              <w:spacing w:before="20" w:after="20" w:line="240" w:lineRule="auto"/>
-              <w:rPr>
-                <w:sz w:val="19"/>
-              </w:rPr>
-            </w:pPr>
-            <w:r>
-              <w:rPr>
-                <w:sz w:val="19"/>
-              </w:rPr>
-              <w:t>38 de 38</w:t>
-            </w:r>
-          </w:p>
-        </w:tc>
-        <w:tc>
-          <w:tcPr>
-            <w:tcW w:w="2340" w:type="dxa"/>
-          </w:tcPr>
-          <w:p>
-            <w:pPr>
-              <w:spacing w:before="20" w:after="20" w:line="240" w:lineRule="auto"/>
-              <w:rPr>
-                <w:sz w:val="19"/>
-              </w:rPr>
-            </w:pPr>
-            <w:r>
-              <w:rPr>
-                <w:sz w:val="19"/>
-                <w:lang w:val="es-AR"/>
-              </w:rPr>
-              <w:t xml:space="preserve">Se sumaron 3 casos borde de la especificación. </w:t>
-            </w:r>
-            <w:r>
-              <w:rPr>
-                <w:sz w:val="19"/>
-              </w:rPr>
-              <w:t>Los seis criterios cumplen</w:t>
-            </w:r>
-          </w:p>
-        </w:tc>
-      </w:tr>
-      <w:tr>
-        <w:tc>
-          <w:tcPr>
-            <w:tcW w:w="2340" w:type="dxa"/>
-          </w:tcPr>
-          <w:p>
-            <w:pPr>
-              <w:spacing w:before="20" w:after="20" w:line="240" w:lineRule="auto"/>
-              <w:rPr>
-                <w:sz w:val="19"/>
-              </w:rPr>
-            </w:pPr>
-            <w:r>
-              <w:rPr>
-                <w:sz w:val="19"/>
-              </w:rPr>
-              <w:t>6</w:t>
-            </w:r>
-          </w:p>
-        </w:tc>
-        <w:tc>
-          <w:tcPr>
-            <w:tcW w:w="2340" w:type="dxa"/>
-          </w:tcPr>
-          <w:p>
-            <w:pPr>
-              <w:spacing w:before="20" w:after="20" w:line="240" w:lineRule="auto"/>
-              <w:rPr>
-                <w:sz w:val="19"/>
-              </w:rPr>
-            </w:pPr>
-            <w:r>
-              <w:rPr>
-                <w:sz w:val="19"/>
-              </w:rPr>
-              <w:t>gemini-3.5-flash-lite</w:t>
-            </w:r>
-          </w:p>
-        </w:tc>
-        <w:tc>
-          <w:tcPr>
-            <w:tcW w:w="2340" w:type="dxa"/>
-          </w:tcPr>
-          <w:p>
-            <w:pPr>
-              <w:spacing w:before="20" w:after="20" w:line="240" w:lineRule="auto"/>
-              <w:rPr>
-                <w:sz w:val="19"/>
-              </w:rPr>
-            </w:pPr>
-            <w:r>
-              <w:rPr>
-                <w:sz w:val="19"/>
-              </w:rPr>
-              <w:t>39 de 39</w:t>
-            </w:r>
-          </w:p>
-        </w:tc>
-        <w:tc>
-          <w:tcPr>
-            <w:tcW w:w="2340" w:type="dxa"/>
-          </w:tcPr>
-          <w:p>
-            <w:pPr>
-              <w:spacing w:before="20" w:after="20" w:line="240" w:lineRule="auto"/>
-              <w:rPr>
-                <w:sz w:val="19"/>
-                <w:lang w:val="es-AR"/>
-              </w:rPr>
-            </w:pPr>
-            <w:r>
-              <w:rPr>
-                <w:sz w:val="19"/>
-                <w:lang w:val="es-AR"/>
-              </w:rPr>
-              <w:t>Se sumó un caso de pregunta ajena a la planta, tras la revisión del proceso</w:t>
-            </w:r>
-          </w:p>
-        </w:tc>
-      </w:tr>
-      <w:tr>
-        <w:tc>
-          <w:tcPr>
-            <w:tcW w:w="2340" w:type="dxa"/>
-          </w:tcPr>
-          <w:p>
-            <w:pPr>
-              <w:spacing w:before="20" w:after="20" w:line="240" w:lineRule="auto"/>
-              <w:rPr>
-                <w:sz w:val="19"/>
-              </w:rPr>
-            </w:pPr>
-            <w:r>
-              <w:rPr>
-                <w:sz w:val="19"/>
-              </w:rPr>
-              <w:t>7</w:t>
-            </w:r>
-          </w:p>
-        </w:tc>
-        <w:tc>
-          <w:tcPr>
-            <w:tcW w:w="2340" w:type="dxa"/>
-          </w:tcPr>
-          <w:p>
-            <w:pPr>
-              <w:spacing w:before="20" w:after="20" w:line="240" w:lineRule="auto"/>
-              <w:rPr>
-                <w:sz w:val="19"/>
-              </w:rPr>
-            </w:pPr>
-            <w:r>
-              <w:rPr>
-                <w:sz w:val="19"/>
-              </w:rPr>
-              <w:t>gemini-3.5-flash-lite</w:t>
-            </w:r>
-          </w:p>
-        </w:tc>
-        <w:tc>
-          <w:tcPr>
-            <w:tcW w:w="2340" w:type="dxa"/>
-          </w:tcPr>
-          <w:p>
-            <w:pPr>
-              <w:spacing w:before="20" w:after="20" w:line="240" w:lineRule="auto"/>
-              <w:rPr>
-                <w:sz w:val="19"/>
-              </w:rPr>
-            </w:pPr>
-            <w:r>
-              <w:rPr>
-                <w:sz w:val="19"/>
-              </w:rPr>
-              <w:t>42 de 42</w:t>
-            </w:r>
-          </w:p>
-        </w:tc>
-        <w:tc>
-          <w:tcPr>
-            <w:tcW w:w="2340" w:type="dxa"/>
-          </w:tcPr>
-          <w:p>
-            <w:pPr>
-              <w:spacing w:before="20" w:after="20" w:line="240" w:lineRule="auto"/>
-              <w:rPr>
-                <w:sz w:val="19"/>
-                <w:lang w:val="es-AR"/>
-              </w:rPr>
-            </w:pPr>
-            <w:r>
-              <w:rPr>
-                <w:sz w:val="19"/>
-                <w:lang w:val="es-AR"/>
-              </w:rPr>
-              <w:t>Tres comportamientos nuevos: período sin datos, unidad y evolución por día. El servicio respondió lento: percentil 90 de 17,6 s</w:t>
-            </w:r>
-          </w:p>
-        </w:tc>
-      </w:tr>
-      <w:tr>
-        <w:tc>
-          <w:tcPr>
-            <w:tcW w:w="2340" w:type="dxa"/>
-          </w:tcPr>
-          <w:p>
-            <w:pPr>
-              <w:spacing w:before="20" w:after="20" w:line="240" w:lineRule="auto"/>
-              <w:rPr>
-                <w:sz w:val="19"/>
-              </w:rPr>
-            </w:pPr>
-            <w:r>
-              <w:rPr>
-                <w:sz w:val="19"/>
-              </w:rPr>
-              <w:t>8</w:t>
-            </w:r>
-          </w:p>
-        </w:tc>
-        <w:tc>
-          <w:tcPr>
-            <w:tcW w:w="2340" w:type="dxa"/>
-          </w:tcPr>
-          <w:p>
-            <w:pPr>
-              <w:spacing w:before="20" w:after="20" w:line="240" w:lineRule="auto"/>
-              <w:rPr>
-                <w:sz w:val="19"/>
-              </w:rPr>
-            </w:pPr>
-            <w:r>
-              <w:rPr>
-                <w:sz w:val="19"/>
-              </w:rPr>
-              <w:t>gemini-3.5-flash-lite</w:t>
-            </w:r>
-          </w:p>
-        </w:tc>
-        <w:tc>
-          <w:tcPr>
-            <w:tcW w:w="2340" w:type="dxa"/>
-          </w:tcPr>
-          <w:p>
-            <w:pPr>
-              <w:spacing w:before="20" w:after="20" w:line="240" w:lineRule="auto"/>
-              <w:rPr>
-                <w:sz w:val="19"/>
-              </w:rPr>
-            </w:pPr>
-            <w:r>
-              <w:rPr>
-                <w:sz w:val="19"/>
-              </w:rPr>
-              <w:t>42 de 42</w:t>
-            </w:r>
-          </w:p>
-        </w:tc>
-        <w:tc>
-          <w:tcPr>
-            <w:tcW w:w="2340" w:type="dxa"/>
-          </w:tcPr>
-          <w:p>
-            <w:pPr>
-              <w:spacing w:before="20" w:after="20" w:line="240" w:lineRule="auto"/>
-              <w:rPr>
-                <w:sz w:val="19"/>
-                <w:lang w:val="es-AR"/>
-              </w:rPr>
-            </w:pPr>
-            <w:r>
-              <w:rPr>
-                <w:sz w:val="19"/>
-                <w:lang w:val="es-AR"/>
-              </w:rPr>
-              <w:t>Repetición con tiempos normales: percentil 90 de 4,8 s</w:t>
-            </w:r>
-          </w:p>
-        </w:tc>
-      </w:tr>
-      <w:tr>
-        <w:tc>
-          <w:tcPr>
-            <w:tcW w:w="2340" w:type="dxa"/>
-          </w:tcPr>
-          <w:p>
-            <w:pPr>
-              <w:spacing w:before="20" w:after="20" w:line="240" w:lineRule="auto"/>
-              <w:rPr>
-                <w:sz w:val="19"/>
-              </w:rPr>
-            </w:pPr>
-            <w:r>
-              <w:rPr>
-                <w:sz w:val="19"/>
-              </w:rPr>
-              <w:t>9 a 11</w:t>
-            </w:r>
-          </w:p>
-        </w:tc>
-        <w:tc>
-          <w:tcPr>
-            <w:tcW w:w="2340" w:type="dxa"/>
-          </w:tcPr>
-          <w:p>
-            <w:pPr>
-              <w:spacing w:before="20" w:after="20" w:line="240" w:lineRule="auto"/>
-              <w:rPr>
-                <w:sz w:val="19"/>
-              </w:rPr>
-            </w:pPr>
-            <w:r>
-              <w:rPr>
-                <w:sz w:val="19"/>
-              </w:rPr>
-              <w:t>gemini-3.5-flash-lite</w:t>
-            </w:r>
-          </w:p>
-        </w:tc>
-        <w:tc>
-          <w:tcPr>
-            <w:tcW w:w="2340" w:type="dxa"/>
-          </w:tcPr>
-          <w:p>
-            <w:pPr>
-              <w:spacing w:before="20" w:after="20" w:line="240" w:lineRule="auto"/>
-              <w:rPr>
-                <w:sz w:val="19"/>
-              </w:rPr>
-            </w:pPr>
-            <w:r>
-              <w:rPr>
-                <w:sz w:val="19"/>
-              </w:rPr>
-              <w:t>35, 41 y 41 de 42</w:t>
-            </w:r>
-          </w:p>
-        </w:tc>
-        <w:tc>
-          <w:tcPr>
-            <w:tcW w:w="2340" w:type="dxa"/>
-          </w:tcPr>
-          <w:p>
-            <w:pPr>
-              <w:spacing w:before="20" w:after="20" w:line="240" w:lineRule="auto"/>
-              <w:rPr>
-                <w:sz w:val="19"/>
-                <w:lang w:val="es-AR"/>
-              </w:rPr>
-            </w:pPr>
-            <w:r>
-              <w:rPr>
-                <w:sz w:val="19"/>
-                <w:lang w:val="es-AR"/>
-              </w:rPr>
               <w:t>Afectadas por caídas del servicio (errores 503 y 504) y cortes de conexión, no por respuestas del agente</w:t>
-            </w:r>
-          </w:p>
-        </w:tc>
-      </w:tr>
-      <w:tr>
-        <w:tc>
-          <w:tcPr>
-            <w:tcW w:w="2340" w:type="dxa"/>
-          </w:tcPr>
-          <w:p>
-            <w:pPr>
-              <w:spacing w:before="20" w:after="20" w:line="240" w:lineRule="auto"/>
-              <w:rPr>
-                <w:sz w:val="19"/>
-              </w:rPr>
-            </w:pPr>
-            <w:r>
-              <w:rPr>
-                <w:sz w:val="19"/>
-              </w:rPr>
-              <w:t>12</w:t>
-            </w:r>
-          </w:p>
-        </w:tc>
-        <w:tc>
-          <w:tcPr>
-            <w:tcW w:w="2340" w:type="dxa"/>
-          </w:tcPr>
-          <w:p>
-            <w:pPr>
-              <w:spacing w:before="20" w:after="20" w:line="240" w:lineRule="auto"/>
-              <w:rPr>
-                <w:sz w:val="19"/>
-              </w:rPr>
-            </w:pPr>
-            <w:r>
-              <w:rPr>
-                <w:sz w:val="19"/>
-              </w:rPr>
-              <w:t>gemini-3.5-flash-lite</w:t>
-            </w:r>
-          </w:p>
-        </w:tc>
-        <w:tc>
-          <w:tcPr>
-            <w:tcW w:w="2340" w:type="dxa"/>
-          </w:tcPr>
-          <w:p>
-            <w:pPr>
-              <w:spacing w:before="20" w:after="20" w:line="240" w:lineRule="auto"/>
-              <w:rPr>
-                <w:sz w:val="19"/>
-              </w:rPr>
-            </w:pPr>
-            <w:r>
-              <w:rPr>
-                <w:sz w:val="19"/>
-              </w:rPr>
-              <w:t>42 de 42</w:t>
-            </w:r>
-          </w:p>
-        </w:tc>
-        <w:tc>
-          <w:tcPr>
-            <w:tcW w:w="2340" w:type="dxa"/>
-          </w:tcPr>
-          <w:p>
-            <w:pPr>
-              <w:spacing w:before="20" w:after="20" w:line="240" w:lineRule="auto"/>
-              <w:rPr>
-                <w:sz w:val="19"/>
-                <w:lang w:val="es-AR"/>
-              </w:rPr>
-            </w:pPr>
-            <w:r>
-              <w:rPr>
-                <w:sz w:val="19"/>
-                <w:lang w:val="es-AR"/>
-              </w:rPr>
-              <w:t>Versión final: conteo en una sola fila y sin unidad en los conteos</w:t>
             </w:r>
           </w:p>
         </w:tc>
@@ -7520,7 +7034,7 @@
           <w:sz w:val="21"/>
           <w:lang w:val="es-AR"/>
         </w:rPr>
-        <w:t xml:space="preserve"> (el enunciado pide al menos dos; se eligieron cuatro)</w:t>
+        <w:t xml:space="preserve"> (el enunciado pide al menos dos; se eligieron cinco)</w:t>
       </w:r>
     </w:p>
     <w:tbl>
@@ -7882,6 +7396,69 @@
           </w:p>
         </w:tc>
       </w:tr>
+      <w:tr>
+        <w:tc>
+          <w:tcPr>
+            <w:tcW w:w="3120" w:type="dxa"/>
+          </w:tcPr>
+          <w:p>
+            <w:pPr>
+              <w:spacing w:before="20" w:after="20" w:line="240" w:lineRule="auto"/>
+              <w:rPr>
+                <w:sz w:val="19"/>
+              </w:rPr>
+            </w:pPr>
+            <w:r>
+              <w:rPr>
+                <w:sz w:val="19"/>
+              </w:rPr>
+              <w:t>Despliegue en la nube</w:t>
+            </w:r>
+          </w:p>
+        </w:tc>
+        <w:tc>
+          <w:tcPr>
+            <w:tcW w:w="3120" w:type="dxa"/>
+          </w:tcPr>
+          <w:p>
+            <w:pPr>
+              <w:spacing w:before="20" w:after="20" w:line="240" w:lineRule="auto"/>
+              <w:rPr>
+                <w:sz w:val="19"/>
+                <w:lang w:val="es-AR"/>
+              </w:rPr>
+            </w:pPr>
+            <w:r>
+              <w:rPr>
+                <w:sz w:val="19"/>
+                <w:lang w:val="es-AR"/>
+              </w:rPr>
+              <w:t>Cumplido. Probado desde otro dispositivo el 15 de octubre de 2026</w:t>
+            </w:r>
+          </w:p>
+        </w:tc>
+        <w:tc>
+          <w:tcPr>
+            <w:tcW w:w="3120" w:type="dxa"/>
+          </w:tcPr>
+          <w:p>
+            <w:pPr>
+              <w:spacing w:before="20" w:after="20" w:line="240" w:lineRule="auto"/>
+              <w:rPr>
+                <w:sz w:val="19"/>
+                <w:lang w:val="es-AR"/>
+              </w:rPr>
+            </w:pPr>
+            <w:r>
+              <w:rPr>
+                <w:sz w:val="19"/>
+                <w:lang w:val="es-AR"/>
+              </w:rPr>
+              <w:t>telemetry-sql-agent.streamlit.app (Streamlit Community Cloud) con la base en Neon: mismas filas que la local en las 8 tablas, 8 de 8 casos contra Neon (eval/results/latest-nube.md), capturas 06 y 07 de docs/informe/capturas/ y specs/002-despliegue-nube/</w:t>
+            </w:r>
+          </w:p>
+        </w:tc>
+      </w:tr>
     </w:tbl>
     <w:p>
       <w:pPr>
@@ -7896,7 +7473,7 @@
           <w:sz w:val="21"/>
           <w:lang w:val="es-AR"/>
         </w:rPr>
-        <w:t>El despliegue en la nube del agente no se eligió como criterio.</w:t>
+        <w:t>El despliegue se hizo como una segunda funcionalidad de Spec Kit, sin cambiar el código del agente. En la nube la app solo tiene la conexión del rol de solo lectura, y su clave de Gemini es aparte, con su propia cuota. Es pública hasta el 30 de octubre de 2026.</w:t>
       </w:r>
     </w:p>
     <w:p>
@@ -8039,14 +7616,14 @@
           <w:sz w:val="21"/>
           <w:lang w:val="es-AR"/>
         </w:rPr>
-        <w:t>Supabase sin probar.</w:t>
-      </w:r>
-      <w:r>
-        <w:rPr>
-          <w:sz w:val="21"/>
-          <w:lang w:val="es-AR"/>
-        </w:rPr>
-        <w:t xml:space="preserve"> El código admite una base en Supabase, pero todas las corridas de este informe usaron el Postgres local con Docker. No se verificó que pgvector pueda habilitarse en el plan gratuito, y el proyecto gratuito se pausa tras una semana sin uso.</w:t>
+        <w:t>Servicios gratuitos en la nube.</w:t>
+      </w:r>
+      <w:r>
+        <w:rPr>
+          <w:sz w:val="21"/>
+          <w:lang w:val="es-AR"/>
+        </w:rPr>
+        <w:t xml:space="preserve"> Streamlit duerme la app tras unas 12 horas sin visitas y tarda unos minutos en despertarla. Neon suspende la base sin uso y la primera respuesta tarda unos segundos más. La evaluación completa se corrió con la base local; contra Neon se corrieron 8 casos, uno por categoría.</w:t>
       </w:r>
     </w:p>
     <w:p>

</xml_diff>

<commit_message>
Informe: corregir las afirmaciones que el despliegue dejo desactualizadas
El informe decia que el agente no estaba en la nube y que la base solo podia
estar en Supabase, que nunca se probo. Ahora describe el despliegue en
Streamlit Community Cloud con la base en Neon. Tambien se precisan cuatro
frases y se agrega specs/002 como evidencia de SDD. Sigue en 10 paginas.

Co-Authored-By: Claude Opus 5.5 <noreply@anthropic.com>
</commit_message>
<xml_diff>
--- a/docs/informe/informe.docx
+++ b/docs/informe/informe.docx
@@ -442,14 +442,21 @@
           <w:sz w:val="21"/>
           <w:lang w:val="es-AR"/>
         </w:rPr>
-        <w:t>Lo que no incluye.</w:t>
-      </w:r>
-      <w:r>
-        <w:rPr>
-          <w:sz w:val="21"/>
-          <w:lang w:val="es-AR"/>
-        </w:rPr>
-        <w:t xml:space="preserve"> El agente no está desplegado en la nube: se ejecuta en la computadora de quien lo usa. Solo la base de datos puede alojarse en la nube (Supabase) o correr local con Docker. El agente no modifica datos: solo lee.</w:t>
+        <w:t>Dónde corre.</w:t>
+      </w:r>
+      <w:r>
+        <w:rPr>
+          <w:sz w:val="21"/>
+          <w:lang w:val="es-AR"/>
+        </w:rPr>
+        <w:t xml:space="preserve"> </w:t>
+      </w:r>
+      <w:r>
+        <w:rPr>
+          <w:sz w:val="21"/>
+          <w:lang w:val="es-AR"/>
+        </w:rPr>
+        <w:t>El agente funciona en local, con la base en Docker, y también está publicado en la nube: la interfaz en Streamlit Community Cloud y la base en Neon. En los dos casos solo lee: no modifica datos.</w:t>
       </w:r>
     </w:p>
     <w:p>
@@ -1096,7 +1103,21 @@
           <w:sz w:val="21"/>
           <w:lang w:val="es-AR"/>
         </w:rPr>
-        <w:t xml:space="preserve"> con la causa que la originó antes de tocar el código. Ninguna cambió las respuestas esperadas de la evaluación.</w:t>
+        <w:t xml:space="preserve"> </w:t>
+      </w:r>
+      <w:r>
+        <w:rPr>
+          <w:sz w:val="21"/>
+          <w:lang w:val="es-AR"/>
+        </w:rPr>
+        <w:t>con la causa que la originó.</w:t>
+      </w:r>
+      <w:r>
+        <w:rPr>
+          <w:sz w:val="21"/>
+          <w:lang w:val="es-AR"/>
+        </w:rPr>
+        <w:t xml:space="preserve"> Ninguna cambió las respuestas esperadas de la evaluación.</w:t>
       </w:r>
     </w:p>
     <w:p>
@@ -1127,7 +1148,14 @@
           <w:sz w:val="21"/>
           <w:lang w:val="es-AR"/>
         </w:rPr>
-        <w:t>La versión 1.2.0 ajustó el principio de evaluación. El 12 de octubre el autor revisó la constitución e hizo las etapas de aclaración y de análisis de Spec Kit, que al inicio se habían salteado.</w:t>
+        <w:t xml:space="preserve">La versión 1.2.0 ajustó el principio de evaluación. El 12 de octubre el autor revisó la constitución </w:t>
+      </w:r>
+      <w:r>
+        <w:rPr>
+          <w:sz w:val="21"/>
+          <w:lang w:val="es-AR"/>
+        </w:rPr>
+        <w:t>y aplicó las etapas de aclaración y de análisis de Spec Kit.</w:t>
       </w:r>
     </w:p>
     <w:p>
@@ -2837,7 +2865,21 @@
                 <w:sz w:val="19"/>
                 <w:lang w:val="es-AR"/>
               </w:rPr>
-              <w:t xml:space="preserve">, pero su capa gratuita permite 20 pedidos por día y la evaluación completa necesita unas 90 llamadas. </w:t>
+              <w:t xml:space="preserve">, pero su capa gratuita permite 20 pedidos por día y la evaluación completa </w:t>
+            </w:r>
+            <w:r>
+              <w:rPr>
+                <w:sz w:val="19"/>
+                <w:lang w:val="es-AR"/>
+              </w:rPr>
+              <w:t>necesitaba unas 90 llamadas</w:t>
+            </w:r>
+            <w:r>
+              <w:rPr>
+                <w:sz w:val="19"/>
+                <w:lang w:val="es-AR"/>
+              </w:rPr>
+              <w:t xml:space="preserve">. </w:t>
             </w:r>
             <w:r>
               <w:rPr>
@@ -3008,7 +3050,14 @@
                 <w:sz w:val="19"/>
                 <w:lang w:val="es-AR"/>
               </w:rPr>
-              <w:t>Una tecnología en lugar de dos. Sirve en Supabase o en un Postgres local</w:t>
+              <w:t xml:space="preserve">Una tecnología en lugar de dos. </w:t>
+            </w:r>
+            <w:r>
+              <w:rPr>
+                <w:sz w:val="19"/>
+                <w:lang w:val="es-AR"/>
+              </w:rPr>
+              <w:t>Funciona en un Postgres local y en Neon</w:t>
             </w:r>
           </w:p>
         </w:tc>
@@ -3311,49 +3360,49 @@
                 <w:sz w:val="19"/>
                 <w:lang w:val="es-AR"/>
               </w:rPr>
-              <w:t>El agente no se despliega en la nube</w:t>
-            </w:r>
-          </w:p>
-        </w:tc>
-        <w:tc>
-          <w:tcPr>
-            <w:tcW w:w="3120" w:type="dxa"/>
-          </w:tcPr>
-          <w:p>
-            <w:pPr>
-              <w:spacing w:before="20" w:after="20" w:line="240" w:lineRule="auto"/>
-              <w:rPr>
-                <w:sz w:val="19"/>
-                <w:lang w:val="es-AR"/>
-              </w:rPr>
-            </w:pPr>
-            <w:r>
-              <w:rPr>
-                <w:sz w:val="19"/>
-                <w:lang w:val="es-AR"/>
-              </w:rPr>
-              <w:t>Fuera de lo que se eligió para este trabajo. Solo la base puede estar en la nube</w:t>
-            </w:r>
-          </w:p>
-        </w:tc>
-        <w:tc>
-          <w:tcPr>
-            <w:tcW w:w="3120" w:type="dxa"/>
-          </w:tcPr>
-          <w:p>
-            <w:pPr>
-              <w:spacing w:before="20" w:after="20" w:line="240" w:lineRule="auto"/>
-              <w:rPr>
-                <w:sz w:val="19"/>
-                <w:lang w:val="es-AR"/>
-              </w:rPr>
-            </w:pPr>
-            <w:r>
-              <w:rPr>
-                <w:sz w:val="19"/>
-                <w:lang w:val="es-AR"/>
-              </w:rPr>
-              <w:t>Streamlit Community Cloud: queda como opción futura, sin haber verificado sus condiciones</w:t>
+              <w:t>Despliegue: interfaz en Streamlit Community Cloud y base en Neon</w:t>
+            </w:r>
+          </w:p>
+        </w:tc>
+        <w:tc>
+          <w:tcPr>
+            <w:tcW w:w="3120" w:type="dxa"/>
+          </w:tcPr>
+          <w:p>
+            <w:pPr>
+              <w:spacing w:before="20" w:after="20" w:line="240" w:lineRule="auto"/>
+              <w:rPr>
+                <w:sz w:val="19"/>
+                <w:lang w:val="es-AR"/>
+              </w:rPr>
+            </w:pPr>
+            <w:r>
+              <w:rPr>
+                <w:sz w:val="19"/>
+                <w:lang w:val="es-AR"/>
+              </w:rPr>
+              <w:t>Los dos son gratuitos y no hizo falta cambiar el código: la conexión y las claves se leen de variables de entorno</w:t>
+            </w:r>
+          </w:p>
+        </w:tc>
+        <w:tc>
+          <w:tcPr>
+            <w:tcW w:w="3120" w:type="dxa"/>
+          </w:tcPr>
+          <w:p>
+            <w:pPr>
+              <w:spacing w:before="20" w:after="20" w:line="240" w:lineRule="auto"/>
+              <w:rPr>
+                <w:sz w:val="19"/>
+                <w:lang w:val="es-AR"/>
+              </w:rPr>
+            </w:pPr>
+            <w:r>
+              <w:rPr>
+                <w:sz w:val="19"/>
+                <w:lang w:val="es-AR"/>
+              </w:rPr>
+              <w:t>Supabase: el proyecto gratuito se pausa tras una semana sin uso y hay que reactivarlo a mano</w:t>
             </w:r>
           </w:p>
         </w:tc>
@@ -3413,18 +3462,10 @@
       </w:r>
       <w:r>
         <w:rPr>
-          <w:b/>
-          <w:sz w:val="21"/>
-          <w:lang w:val="es-AR"/>
-        </w:rPr>
-        <w:t>Sigue sin verificar</w:t>
-      </w:r>
-      <w:r>
-        <w:rPr>
-          <w:sz w:val="21"/>
-          <w:lang w:val="es-AR"/>
-        </w:rPr>
-        <w:t xml:space="preserve"> si pgvector se puede habilitar en el plan gratuito de Supabase: todas las corridas de este informe se hicieron con el Postgres local de Docker.</w:t>
+          <w:sz w:val="21"/>
+          <w:lang w:val="es-AR"/>
+        </w:rPr>
+        <w:t>En la nube se usó Neon, donde pgvector funcionó; Supabase no se probó. La evaluación completa se corrió con el Postgres local de Docker.</w:t>
       </w:r>
     </w:p>
     <w:p>
@@ -3920,7 +3961,7 @@
                 <w:sz w:val="19"/>
                 <w:lang w:val="es-AR"/>
               </w:rPr>
-              <w:t xml:space="preserve">31 casos cortados por la cuota gratuita: 20 pedidos </w:t>
+              <w:t xml:space="preserve">31 casos cortados por la </w:t>
             </w:r>
             <w:r>
               <w:rPr>
@@ -3928,7 +3969,7 @@
                 <w:lang w:val="es-AR"/>
               </w:rPr>
               <w:lastRenderedPageBreak/>
-              <w:t>por día</w:t>
+              <w:t>cuota gratuita: 20 pedidos por día</w:t>
             </w:r>
           </w:p>
         </w:tc>
@@ -4958,75 +4999,49 @@
                 <w:sz w:val="19"/>
                 <w:lang w:val="es-AR"/>
               </w:rPr>
-              <w:t xml:space="preserve">El agente inventó una presión </w:t>
-            </w:r>
-            <w:r>
-              <w:rPr>
-                <w:sz w:val="19"/>
-                <w:lang w:val="es-AR"/>
-              </w:rPr>
-              <w:lastRenderedPageBreak/>
-              <w:t>nominal</w:t>
-            </w:r>
-          </w:p>
-        </w:tc>
-        <w:tc>
-          <w:tcPr>
-            <w:tcW w:w="3120" w:type="dxa"/>
-          </w:tcPr>
-          <w:p>
-            <w:pPr>
-              <w:spacing w:before="20" w:after="20" w:line="240" w:lineRule="auto"/>
-              <w:rPr>
-                <w:sz w:val="19"/>
-                <w:lang w:val="es-AR"/>
-              </w:rPr>
-            </w:pPr>
-            <w:r>
-              <w:rPr>
-                <w:sz w:val="19"/>
-                <w:lang w:val="es-AR"/>
-              </w:rPr>
-              <w:lastRenderedPageBreak/>
-              <w:t xml:space="preserve">El SQL devolvió el umbral crítico </w:t>
-            </w:r>
-            <w:r>
-              <w:rPr>
-                <w:sz w:val="19"/>
-                <w:lang w:val="es-AR"/>
-              </w:rPr>
-              <w:lastRenderedPageBreak/>
-              <w:t>con el nombre del dato pedido</w:t>
-            </w:r>
-          </w:p>
-        </w:tc>
-        <w:tc>
-          <w:tcPr>
-            <w:tcW w:w="3120" w:type="dxa"/>
-          </w:tcPr>
-          <w:p>
-            <w:pPr>
-              <w:spacing w:before="20" w:after="20" w:line="240" w:lineRule="auto"/>
-              <w:rPr>
-                <w:sz w:val="19"/>
-                <w:lang w:val="es-AR"/>
-              </w:rPr>
-            </w:pPr>
-            <w:r>
-              <w:rPr>
-                <w:sz w:val="19"/>
-                <w:lang w:val="es-AR"/>
-              </w:rPr>
-              <w:lastRenderedPageBreak/>
-              <w:t xml:space="preserve">Reglas nuevas en los prompts de SQL </w:t>
-            </w:r>
-            <w:r>
-              <w:rPr>
-                <w:sz w:val="19"/>
-                <w:lang w:val="es-AR"/>
-              </w:rPr>
-              <w:lastRenderedPageBreak/>
-              <w:t>y de síntesis (T052)</w:t>
+              <w:t>El agente inventó una presión nominal</w:t>
+            </w:r>
+          </w:p>
+        </w:tc>
+        <w:tc>
+          <w:tcPr>
+            <w:tcW w:w="3120" w:type="dxa"/>
+          </w:tcPr>
+          <w:p>
+            <w:pPr>
+              <w:spacing w:before="20" w:after="20" w:line="240" w:lineRule="auto"/>
+              <w:rPr>
+                <w:sz w:val="19"/>
+                <w:lang w:val="es-AR"/>
+              </w:rPr>
+            </w:pPr>
+            <w:r>
+              <w:rPr>
+                <w:sz w:val="19"/>
+                <w:lang w:val="es-AR"/>
+              </w:rPr>
+              <w:t>El SQL devolvió el umbral crítico con el nombre del dato pedido</w:t>
+            </w:r>
+          </w:p>
+        </w:tc>
+        <w:tc>
+          <w:tcPr>
+            <w:tcW w:w="3120" w:type="dxa"/>
+          </w:tcPr>
+          <w:p>
+            <w:pPr>
+              <w:spacing w:before="20" w:after="20" w:line="240" w:lineRule="auto"/>
+              <w:rPr>
+                <w:sz w:val="19"/>
+                <w:lang w:val="es-AR"/>
+              </w:rPr>
+            </w:pPr>
+            <w:r>
+              <w:rPr>
+                <w:sz w:val="19"/>
+                <w:lang w:val="es-AR"/>
+              </w:rPr>
+              <w:t>Reglas nuevas en los prompts de SQL y de síntesis (T052)</w:t>
             </w:r>
           </w:p>
         </w:tc>
@@ -5049,7 +5064,6 @@
                 <w:sz w:val="19"/>
                 <w:lang w:val="es-AR"/>
               </w:rPr>
-              <w:lastRenderedPageBreak/>
               <w:t>Respondió "no tengo esa información" con filas correctas</w:t>
             </w:r>
           </w:p>
@@ -5472,7 +5486,15 @@
                 <w:sz w:val="19"/>
                 <w:lang w:val="es-AR"/>
               </w:rPr>
-              <w:t>¿Cuál fue el valor máximo de temperatura registrado en el motor M-301?</w:t>
+              <w:t xml:space="preserve">¿Cuál fue el valor máximo </w:t>
+            </w:r>
+            <w:r>
+              <w:rPr>
+                <w:sz w:val="19"/>
+                <w:lang w:val="es-AR"/>
+              </w:rPr>
+              <w:lastRenderedPageBreak/>
+              <w:t>de temperatura registrado en el motor M-301?</w:t>
             </w:r>
           </w:p>
         </w:tc>
@@ -5491,6 +5513,7 @@
               <w:rPr>
                 <w:sz w:val="19"/>
               </w:rPr>
+              <w:lastRenderedPageBreak/>
               <w:t>Base</w:t>
             </w:r>
           </w:p>
@@ -5531,7 +5554,15 @@
                 <w:sz w:val="19"/>
                 <w:lang w:val="es-AR"/>
               </w:rPr>
-              <w:t>El valor máximo de temperatura registrado en el motor M-301 fue de 105.44.</w:t>
+              <w:t xml:space="preserve">El valor máximo de </w:t>
+            </w:r>
+            <w:r>
+              <w:rPr>
+                <w:sz w:val="19"/>
+                <w:lang w:val="es-AR"/>
+              </w:rPr>
+              <w:lastRenderedPageBreak/>
+              <w:t>temperatura registrado en el motor M-301 fue de 105.44.</w:t>
             </w:r>
           </w:p>
         </w:tc>
@@ -5554,6 +5585,7 @@
                 <w:sz w:val="19"/>
                 <w:lang w:val="es-AR"/>
               </w:rPr>
+              <w:lastRenderedPageBreak/>
               <w:t>¿Cuántas alarmas críticas hubo en el área Bombeo de agua?</w:t>
             </w:r>
           </w:p>
@@ -5972,15 +6004,7 @@
                 <w:sz w:val="19"/>
                 <w:lang w:val="es-AR"/>
               </w:rPr>
-              <w:t xml:space="preserve">¿Cuánto cuesta un </w:t>
-            </w:r>
-            <w:r>
-              <w:rPr>
-                <w:sz w:val="19"/>
-                <w:lang w:val="es-AR"/>
-              </w:rPr>
-              <w:lastRenderedPageBreak/>
-              <w:t>rodamiento de repuesto?</w:t>
+              <w:t>¿Cuánto cuesta un rodamiento de repuesto?</w:t>
             </w:r>
           </w:p>
         </w:tc>
@@ -5999,7 +6023,6 @@
               <w:rPr>
                 <w:sz w:val="19"/>
               </w:rPr>
-              <w:lastRenderedPageBreak/>
               <w:t>Ninguna (no hay dato)</w:t>
             </w:r>
           </w:p>
@@ -6021,15 +6044,7 @@
                 <w:sz w:val="19"/>
                 <w:lang w:val="es-AR"/>
               </w:rPr>
-              <w:t xml:space="preserve">Dice que no tiene la </w:t>
-            </w:r>
-            <w:r>
-              <w:rPr>
-                <w:sz w:val="19"/>
-                <w:lang w:val="es-AR"/>
-              </w:rPr>
-              <w:lastRenderedPageBreak/>
-              <w:t>información</w:t>
+              <w:t>Dice que no tiene la información</w:t>
             </w:r>
           </w:p>
         </w:tc>
@@ -6048,7 +6063,6 @@
               <w:rPr>
                 <w:sz w:val="19"/>
               </w:rPr>
-              <w:lastRenderedPageBreak/>
               <w:t>No tengo esa información.</w:t>
             </w:r>
           </w:p>
@@ -6123,6 +6137,7 @@
           <w:noProof/>
           <w:sz w:val="21"/>
         </w:rPr>
+        <w:lastRenderedPageBreak/>
         <w:drawing>
           <wp:inline distT="0" distB="0" distL="0" distR="0" wp14:anchorId="383ABE1E" wp14:editId="628F97A9">
             <wp:extent cx="4445000" cy="2778125"/>
@@ -7169,20 +7184,7 @@
                 <w:rStyle w:val="CodeChar"/>
                 <w:sz w:val="19"/>
               </w:rPr>
-              <w:t>.specify/</w:t>
-            </w:r>
-            <w:r>
-              <w:rPr>
-                <w:sz w:val="19"/>
-              </w:rPr>
-              <w:t xml:space="preserve"> y </w:t>
-            </w:r>
-            <w:r>
-              <w:rPr>
-                <w:rStyle w:val="CodeChar"/>
-                <w:sz w:val="19"/>
-              </w:rPr>
-              <w:t>specs/001-agente-sql-telemetria/</w:t>
+              <w:t>.specify/, specs/001-agente-sql-telemetria/ y specs/002-despliegue-nube/</w:t>
             </w:r>
           </w:p>
         </w:tc>
@@ -7361,7 +7363,7 @@
                 <w:sz w:val="19"/>
                 <w:lang w:val="es-AR"/>
               </w:rPr>
-              <w:t xml:space="preserve">Cumplido. Trazas, conjunto de datos y experimento de evaluación en el </w:t>
+              <w:t xml:space="preserve">Cumplido. Trazas, conjunto de datos </w:t>
             </w:r>
             <w:r>
               <w:rPr>
@@ -7369,7 +7371,7 @@
                 <w:lang w:val="es-AR"/>
               </w:rPr>
               <w:lastRenderedPageBreak/>
-              <w:t>servicio real</w:t>
+              <w:t>y experimento de evaluación en el servicio real</w:t>
             </w:r>
           </w:p>
         </w:tc>
@@ -7391,7 +7393,15 @@
                 <w:lang w:val="es-AR"/>
               </w:rPr>
               <w:lastRenderedPageBreak/>
-              <w:t>Captura de una traza con sus pasos y tiempos en la sección de evidencias</w:t>
+              <w:t xml:space="preserve">Captura de una traza con sus pasos y </w:t>
+            </w:r>
+            <w:r>
+              <w:rPr>
+                <w:sz w:val="19"/>
+                <w:lang w:val="es-AR"/>
+              </w:rPr>
+              <w:lastRenderedPageBreak/>
+              <w:t>tiempos en la sección de evidencias</w:t>
             </w:r>
           </w:p>
         </w:tc>
@@ -7412,6 +7422,7 @@
               <w:rPr>
                 <w:sz w:val="19"/>
               </w:rPr>
+              <w:lastRenderedPageBreak/>
               <w:t>Despliegue en la nube</w:t>
             </w:r>
           </w:p>
@@ -7623,7 +7634,21 @@
           <w:sz w:val="21"/>
           <w:lang w:val="es-AR"/>
         </w:rPr>
-        <w:t xml:space="preserve"> Streamlit duerme la app tras unas 12 horas sin visitas y tarda unos minutos en despertarla. Neon suspende la base sin uso y la primera respuesta tarda unos segundos más. La evaluación completa se corrió con la base local; contra Neon se corrieron 8 casos, uno por categoría.</w:t>
+        <w:t xml:space="preserve"> </w:t>
+      </w:r>
+      <w:r>
+        <w:rPr>
+          <w:sz w:val="21"/>
+          <w:lang w:val="es-AR"/>
+        </w:rPr>
+        <w:t>Streamlit duerme la app cuando pasa un tiempo sin visitas, y la primera visita tiene que despertarla. Neon suspende la base sin uso, así que la primera consulta tarda más.</w:t>
+      </w:r>
+      <w:r>
+        <w:rPr>
+          <w:sz w:val="21"/>
+          <w:lang w:val="es-AR"/>
+        </w:rPr>
+        <w:t xml:space="preserve"> La evaluación completa se corrió con la base local; contra Neon se corrieron 8 casos, uno por categoría.</w:t>
       </w:r>
     </w:p>
     <w:p>

</xml_diff>